<commit_message>
2026 updates to AI ESR. Finished version has been submitted.
</commit_message>
<xml_diff>
--- a/AI_GroundfishCondition_2026.docx
+++ b/AI_GroundfishCondition_2026.docx
@@ -7,7 +7,25 @@
         <w:pStyle w:val="Title"/>
       </w:pPr>
       <w:r>
-        <w:t xml:space="preserve">Aleutian Islands Groundfish Condition</w:t>
+        <w:t xml:space="preserve">Aleutian</w:t>
+      </w:r>
+      <w:r>
+        <w:t xml:space="preserve"> </w:t>
+      </w:r>
+      <w:r>
+        <w:t xml:space="preserve">Islands</w:t>
+      </w:r>
+      <w:r>
+        <w:t xml:space="preserve"> </w:t>
+      </w:r>
+      <w:r>
+        <w:t xml:space="preserve">Groundfish</w:t>
+      </w:r>
+      <w:r>
+        <w:t xml:space="preserve"> </w:t>
+      </w:r>
+      <w:r>
+        <w:t xml:space="preserve">Condition</w:t>
       </w:r>
     </w:p>
     <w:p>
@@ -55,8 +73,8 @@
       </w:r>
       <w:r>
         <w:rPr>
+          <w:bCs/>
           <w:b/>
-          <w:bCs/>
         </w:rPr>
         <w:t xml:space="preserve">Contact</w:t>
       </w:r>
@@ -79,13 +97,28 @@
       </w:r>
       <w:r>
         <w:rPr>
+          <w:bCs/>
           <w:b/>
+        </w:rPr>
+        <w:t xml:space="preserve">Last updated</w:t>
+      </w:r>
+      <w:r>
+        <w:t xml:space="preserve">: September 2026</w:t>
+      </w:r>
+    </w:p>
+    <w:p>
+      <w:pPr>
+        <w:pStyle w:val="BodyText"/>
+      </w:pPr>
+      <w:r>
+        <w:rPr>
           <w:bCs/>
-        </w:rPr>
-        <w:t xml:space="preserve">Last updated</w:t>
-      </w:r>
-      <w:r>
-        <w:t xml:space="preserve">: September 2026</w:t>
+          <w:b/>
+        </w:rPr>
+        <w:t xml:space="preserve">Description of Indicator</w:t>
+      </w:r>
+      <w:r>
+        <w:t xml:space="preserve">: Length-weight residuals represent how heavy a fish is per unit body length and are an indicator of somatic growth variability (Brodeur et al., 2004). Therefore, length-weight residuals can be considered indicators of prey availability, growth, general health, and habitat condition (Blackwell et al., 2000; Froese, 2006). Positive length-weight residuals indicate better condition (i.e., heavier per unit length) and negative residuals indicate poorer condition (i.e., lighter per unit length) (Froese, 2006). Fish condition calculated in this way reflects realized outcomes of intrinsic and extrinsic processes that affect fish growth, which can have implications for biological productivity through direct effects on growth and indirect effects on demographic processes, such as reproduction and mortality (e.g., Rodgveller, 2019; Barbeaux et al., 2020).</w:t>
       </w:r>
     </w:p>
     <w:p>
@@ -93,23 +126,77 @@
         <w:pStyle w:val="BodyText"/>
       </w:pPr>
       <w:r>
-        <w:rPr>
-          <w:b/>
-          <w:bCs/>
-        </w:rPr>
-        <w:t xml:space="preserve">Description of Indicator</w:t>
-      </w:r>
-      <w:r>
-        <w:t xml:space="preserve">: Morphometric condition indicators based on length-weight relationships characterize variation in somatic growth and can be considered indicators of prey availability, growth, general health, and habitat condition</w:t>
-      </w:r>
-      <w:r>
-        <w:t xml:space="preserve"> </w:t>
-      </w:r>
-      <w:r>
-        <w:t xml:space="preserve">(Blackwell et al., 2000; Froese, 2006)</w:t>
-      </w:r>
-      <w:r>
-        <w:t xml:space="preserve">. This contribution presents two morphometric condition indicators based on length-weight relationships: a new relative condition indicator that is estimated using a spatiotemporal model and the historical indicator based on residuals of the length-weight relationship.</w:t>
+        <w:t xml:space="preserve">The groundfish morphometric condition indicator is calculated from paired fork lengths (mm) and weights (g) of individual fish that were collected during biennial bottom trawl surveys of the Aleutian Islands (AI), which were conducted by the Alaska Fisheries Science Center’s Resource Assessment and Conservation Engineering (AFSC/RACE) Groundfish Assessment Program (GAP). Fish condition analyses were applied to walleye pollock (</w:t>
+      </w:r>
+      <w:r>
+        <w:rPr>
+          <w:iCs/>
+          <w:i/>
+        </w:rPr>
+        <w:t xml:space="preserve">Gadus chalcogrammus</w:t>
+      </w:r>
+      <w:r>
+        <w:t xml:space="preserve">), Pacific cod (</w:t>
+      </w:r>
+      <w:r>
+        <w:rPr>
+          <w:iCs/>
+          <w:i/>
+        </w:rPr>
+        <w:t xml:space="preserve">Gadus macrocephalus</w:t>
+      </w:r>
+      <w:r>
+        <w:t xml:space="preserve">), arrowtooth flounder (</w:t>
+      </w:r>
+      <w:r>
+        <w:rPr>
+          <w:iCs/>
+          <w:i/>
+        </w:rPr>
+        <w:t xml:space="preserve">Atheresthes stomias</w:t>
+      </w:r>
+      <w:r>
+        <w:t xml:space="preserve">), Atka mackerel (</w:t>
+      </w:r>
+      <w:r>
+        <w:rPr>
+          <w:iCs/>
+          <w:i/>
+        </w:rPr>
+        <w:t xml:space="preserve">Pleurogrammus monopterygius</w:t>
+      </w:r>
+      <w:r>
+        <w:t xml:space="preserve">), northern rockfish (</w:t>
+      </w:r>
+      <w:r>
+        <w:rPr>
+          <w:iCs/>
+          <w:i/>
+        </w:rPr>
+        <w:t xml:space="preserve">Sebastes polyspinis</w:t>
+      </w:r>
+      <w:r>
+        <w:t xml:space="preserve">), and Pacific ocean perch (</w:t>
+      </w:r>
+      <w:r>
+        <w:rPr>
+          <w:iCs/>
+          <w:i/>
+        </w:rPr>
+        <w:t xml:space="preserve">Sebastes alutus</w:t>
+      </w:r>
+      <w:r>
+        <w:t xml:space="preserve">). Southern rock sole (</w:t>
+      </w:r>
+      <w:r>
+        <w:rPr>
+          <w:iCs/>
+          <w:i/>
+        </w:rPr>
+        <w:t xml:space="preserve">Lepidopsetta bilineata</w:t>
+      </w:r>
+      <w:r>
+        <w:t xml:space="preserve">) was also analyzed in previous survey years but was not sampled in 2026. All species were collected in trawls with satisfactory performance at stratified random stations within the following subareas: southern Bering Sea, eastern Aleutians, central Aleutians, and western Aleutians (Figure 1).</w:t>
       </w:r>
     </w:p>
     <w:p>
@@ -117,7 +204,112 @@
         <w:pStyle w:val="BodyText"/>
       </w:pPr>
       <w:r>
-        <w:t xml:space="preserve">To calculate indicators, length-weight relationships were estimated from linear regression models based on a log-transformation of the exponential growth relationship, W = aLb, where W is weight (g) and L is fork length (mm) for all areas for the period 1991–2026. Unique unique intercepts and (a) and slopes (b) were estimated for each survey stratum, sex, and interaction between stratum and sex to account for sexual dimorphism and spatial-temporal variation in growth and bottom trawl survey sampling. Length-weight relationships for 100–250 mm fork length walleye pollock (corresponding with ages 1–2 years) were calculated separately from adult walleye pollock (&gt; 250 mm). Residuals for individual fish were obtained by subtracting observed weights from bias-corrected weights-at-length that were estimated from regression models. Individual length-weight residuals were aggregated and averaged for each stratum, weighted based on the proportion to total biomass in each stratum from area-swept expansion of bottom-trawl survey catch per unit effort (CPUE; i.e., design-based stratum biomass estimates). Variation in fish condition was evaluated by comparing average length-weight residuals among years. To minimize the influence of unrepresentative samples on indicator calculations, combinations of species, stratum, and year with a sample size &lt; 10 were used to fit length-weight regressions but were excluded from calculating length-weight residuals. Morphometric condition indicator time series, code for calculating the indicators, and figures showing results for individual species are available through the akfishcondition R package and GitHub repository (</w:t>
+        <w:t xml:space="preserve">To calculate indicators, length-weight relationships were estimated from linear regression models based on a log-transformation of the exponential growth relationship,</w:t>
+      </w:r>
+      <w:r>
+        <w:t xml:space="preserve"> </w:t>
+      </w:r>
+      <w:r>
+        <w:rPr>
+          <w:iCs/>
+          <w:i/>
+        </w:rPr>
+        <w:t xml:space="preserve">W</w:t>
+      </w:r>
+      <w:r>
+        <w:t xml:space="preserve"> </w:t>
+      </w:r>
+      <w:r>
+        <w:t xml:space="preserve">=</w:t>
+      </w:r>
+      <w:r>
+        <w:t xml:space="preserve"> </w:t>
+      </w:r>
+      <w:r>
+        <w:rPr>
+          <w:iCs/>
+          <w:i/>
+        </w:rPr>
+        <w:t xml:space="preserve">aL</w:t>
+      </w:r>
+      <w:r>
+        <w:rPr>
+          <w:iCs/>
+          <w:i/>
+          <w:vertAlign w:val="superscript"/>
+        </w:rPr>
+        <w:t xml:space="preserve">b</w:t>
+      </w:r>
+      <w:r>
+        <w:t xml:space="preserve">, where</w:t>
+      </w:r>
+      <w:r>
+        <w:t xml:space="preserve"> </w:t>
+      </w:r>
+      <w:r>
+        <w:rPr>
+          <w:iCs/>
+          <w:i/>
+        </w:rPr>
+        <w:t xml:space="preserve">W</w:t>
+      </w:r>
+      <w:r>
+        <w:t xml:space="preserve"> </w:t>
+      </w:r>
+      <w:r>
+        <w:t xml:space="preserve">is weight (g) and</w:t>
+      </w:r>
+      <w:r>
+        <w:t xml:space="preserve"> </w:t>
+      </w:r>
+      <w:r>
+        <w:rPr>
+          <w:iCs/>
+          <w:i/>
+        </w:rPr>
+        <w:t xml:space="preserve">L</w:t>
+      </w:r>
+      <w:r>
+        <w:t xml:space="preserve"> </w:t>
+      </w:r>
+      <w:r>
+        <w:t xml:space="preserve">is fork length (mm) for all areas for the period 1991–2026. Unique intercepts (</w:t>
+      </w:r>
+      <w:r>
+        <w:rPr>
+          <w:iCs/>
+          <w:i/>
+        </w:rPr>
+        <w:t xml:space="preserve">a</w:t>
+      </w:r>
+      <w:r>
+        <w:t xml:space="preserve">) and slopes (</w:t>
+      </w:r>
+      <w:r>
+        <w:rPr>
+          <w:iCs/>
+          <w:i/>
+        </w:rPr>
+        <w:t xml:space="preserve">b</w:t>
+      </w:r>
+      <w:r>
+        <w:t xml:space="preserve">) were estimated for each species, survey stratum, sex, and interaction between stratum and sex to account for sexual dimorphism and spatial-temporal variation in growth and bottom trawl survey sampling. Length-weight relationships for 100–250 mm fork length walleye pollock (corresponding with ages 1–2 years) were calculated separately from adult walleye pollock (&gt; 250 mm). Residuals for individual fish were obtained by subtracting observed weights from bias-corrected weights-at-length that were estimated from regression models. Length-weight residuals from each stratum were aggregated and weighted proportionally to total biomass in each stratum from area-swept expansion of mean bottom-trawl survey catch per unit effort (CPUE; i.e., design-based stratum biomass estimates). Variation in fish condition was evaluated by comparing average length-weight residuals among years. To minimize the influence of unrepresentative samples on indicator calculations, combinations of species, stratum, and year with a sample size &lt;10 were used to fit length-weight regressions, but were excluded from calculating length-weight residuals. Morphometric condition indicator time series, code for calculating the indicators, and figures showing results for individual species are available through the</w:t>
+      </w:r>
+      <w:r>
+        <w:t xml:space="preserve"> </w:t>
+      </w:r>
+      <w:r>
+        <w:rPr>
+          <w:iCs/>
+          <w:i/>
+        </w:rPr>
+        <w:t xml:space="preserve">akfishcondition</w:t>
+      </w:r>
+      <w:r>
+        <w:t xml:space="preserve"> </w:t>
+      </w:r>
+      <w:r>
+        <w:t xml:space="preserve">R package and GitHub repository (</w:t>
       </w:r>
       <w:hyperlink r:id="rId21">
         <w:r>
@@ -140,7 +332,7 @@
           <wp:inline>
             <wp:extent cx="5334000" cy="4121727"/>
             <wp:effectExtent b="0" l="0" r="0" t="0"/>
-            <wp:docPr descr="Figure 1. National Marine Fisheries Service (NMFS) Alaska Fisheries Science Center (AFSC) Resource Assessment and Conservation Engineering Groundfish Assessment Program (RACE-GAP) Aleutian Islands summer bottom trawl survey area with International North Pacific Fisheries Commission (INPFC) statistical fishing strata delineated by the purple lines." title="" id="23" name="Picture"/>
+            <wp:docPr descr="Figure 1. National Marine Fisheries Service (NMFS) Alaska Fisheries Science Center (AFSC) Resource Assessment and Conservation Engineering Groundfish Assessment Program (RACE-GAP) Aleutian Islands summer bottom trawl survey area with International North Pacific Fisheries Commission (INPFC) statistical fishing subareas delineated by the purple lines." title="" id="23" name="Picture"/>
             <a:graphic>
               <a:graphicData uri="http://schemas.openxmlformats.org/drawingml/2006/picture">
                 <pic:pic>
@@ -183,7 +375,7 @@
         <w:pStyle w:val="ImageCaption"/>
       </w:pPr>
       <w:r>
-        <w:t xml:space="preserve">Figure 1. National Marine Fisheries Service (NMFS) Alaska Fisheries Science Center (AFSC) Resource Assessment and Conservation Engineering Groundfish Assessment Program (RACE-GAP) Aleutian Islands summer bottom trawl survey area with International North Pacific Fisheries Commission (INPFC) statistical fishing strata delineated by the purple lines.</w:t>
+        <w:t xml:space="preserve">Figure 1. National Marine Fisheries Service (NMFS) Alaska Fisheries Science Center (AFSC) Resource Assessment and Conservation Engineering Groundfish Assessment Program (RACE-GAP) Aleutian Islands summer bottom trawl survey area with International North Pacific Fisheries Commission (INPFC) statistical fishing subareas delineated by the purple lines.</w:t>
       </w:r>
     </w:p>
     <w:p>
@@ -192,13 +384,21 @@
       </w:pPr>
       <w:r>
         <w:rPr>
+          <w:bCs/>
           <w:b/>
-          <w:bCs/>
         </w:rPr>
         <w:t xml:space="preserve">Status and Trends</w:t>
       </w:r>
       <w:r>
-        <w:t xml:space="preserve">: Body condition varied amongst survey years for all species considered (Figure 2). Prior to 2010, the AI bottom trawl survey was characterized by condition cycling between positive and negative values through the years. Condition of most species since 2012 has primarily been below the long term average or neutral. Exceptions occur for 100–250 mm walleye pollock in 2016 and Atka mackerel in 2012 where the residual body condition is neutral or slightly positive. Overall, walleye pollock have fluctuated around the mean and are near the average in 2022. Walleye pollock &gt; 250 mm had above average condition in 2010 and declined from 2010 - 2016, but were near average condition in 2018 and 2022. Atka mackerel showed above average condition in 2010, declined to below average by 2014, but have been near average since 2016. Southern rock sole residual body condition is trending positive in the Aleutians since 2012. Southern rock sole are near the time series mean in 2022. Pacific cod, northern rockfish, arrowtooth flounder, and Pacific ocean perch were above or near average condition in 2010, but subsequently had declining conditions through 2018. These species were in better condition in 2022 than 2018, but are still below their time series means. Notably, in 2022, residual body condition remained at neutral or became slightly more positive than the condition values since 2010 for all species considered, although the body condition of all species besides southern rock sole remain below the long term average for both the historical and model-based index.</w:t>
+        <w:t xml:space="preserve">: Body condition has varied among years for all species considered (Figures 2 &amp; 3). Prior to 2010, the condition for most species cycled between positive and negative values through the years. Condition for most species has primarily been near-average (within 1 standard deviation [SD]) or below (&gt; 1 SD) the time series mean since 2012. The exception to this was 100–250 mm walleye pollock in 2024, where the residual body condition was two standard deviations higher than the time series mean. Body condition for walleye pollock &gt; 250 mm has been declining since 2022 and was below the time series mean in 2026, reaching the lowest condition since 2016. In contrast, 100-250 mm walleye pollock were in below average condition in 2022, reached the highest condition of the time series in 2024, and decreased in 2026 to slightly above the time series mean. Atka mackerel was above average in 2010 and has generally shown a decreasing trend since then, but was near-average in 2026. Southern rock sole body condition has been trending positive in the Aleutians since 2012, and was just above the time series mean in 2024. Southern rock sole individual length-weight measurements were not collected in 2026. Pacific cod and arrowtooth flounder were above average condition in 2010, but subsequently had declining condition through 2018 before increasing in 2022. Pacific cod and arrowtooth flounder remained below, but within one SD of the time series mean in 2026. Northern rockfish and Pacific ocean perch condition has shown a decreasing trend since 2010, with both species reaching their lowest values in the time series in 2026. Notably, residual body condition was below the time series mean for all species sampled in 2026 except 100-250 mm walleye pollock, and more than one standard deviation or more below the mean for walleye pollock &gt; 250 mm, northern rockfish, and Pacific ocean perch.</w:t>
+      </w:r>
+    </w:p>
+    <w:p>
+      <w:pPr>
+        <w:pStyle w:val="BodyText"/>
+      </w:pPr>
+      <w:r>
+        <w:t xml:space="preserve">In 2026, condition was negative in every subarea with an estimate for walleye pollock &gt; 250 mm, Pacific cod, arrowtooth flounder, Atka mackerel, northern rockfish, and Pacific ocean perch (Figure 3). For Pacific cod, Atka mackerel, northern rockfish, and Pacific ocean perch, this included all four subareas (southern Bering Sea, eastern Aleutians, central Aleutians, and western Aleutians) in both 2024 and 2026. By comparison, Atka mackerel condition in 2022 was positive in the central and eastern Aleutians but negative in the western Aleutians and southern Bering Sea. Walleye pollock &gt; 250 mm were negative in the western Aleutians, eastern Aleutians, and southern Bering Sea in 2024 and 2026, with the most negative values in the southern Bering Sea in 2026. In contrast, 100-250 mm walleye pollock were in positive condition in the western and eastern Aleutians in 2024 and 2026, the only two subarea with estimates in those years, and in 2022, the only estimate was for the central Aleutians, where condition was negative.</w:t>
       </w:r>
     </w:p>
     <w:p>
@@ -210,7 +410,7 @@
           <wp:inline>
             <wp:extent cx="5334000" cy="6223000"/>
             <wp:effectExtent b="0" l="0" r="0" t="0"/>
-            <wp:docPr descr="Figure 2. Weighted length-weight residuals for seven groundfish species collected during AFSC/RACE GAP standard summer bottom trawl surveys of the Aleutian Islands, 1991–2026. Filled bars denote weighted length-weight residuals using this year’s indicator calculation. Error bars denote standard errors, thin black lines are 2 standard errors and thick blue boxes are 1 standard error." title="" id="26" name="Picture"/>
+            <wp:docPr descr="Figure 2. Morphometric condition of groundfish species collected during AFSC/RACE GAP standard summer bottom trawl surveys of the Aleutian Islands (1991 to 2026) based on residuals of length-weight regressions. The dash in the blue boxes denotes the mean for that year, the box denotes one standard error, and the lines on the boxes denote two standard errors. Lines on each plot represent the historical mean, dashed lines denote one standard deviation, and dotted lines denote two standard deviations." title="" id="26" name="Picture"/>
             <a:graphic>
               <a:graphicData uri="http://schemas.openxmlformats.org/drawingml/2006/picture">
                 <pic:pic>
@@ -253,7 +453,7 @@
         <w:pStyle w:val="ImageCaption"/>
       </w:pPr>
       <w:r>
-        <w:t xml:space="preserve">Figure 2. Weighted length-weight residuals for seven groundfish species collected during AFSC/RACE GAP standard summer bottom trawl surveys of the Aleutian Islands, 1991–2026. Filled bars denote weighted length-weight residuals using this year’s indicator calculation. Error bars denote standard errors, thin black lines are 2 standard errors and thick blue boxes are 1 standard error.</w:t>
+        <w:t xml:space="preserve">Figure 2. Morphometric condition of groundfish species collected during AFSC/RACE GAP standard summer bottom trawl surveys of the Aleutian Islands (1991 to 2026) based on residuals of length-weight regressions. The dash in the blue boxes denotes the mean for that year, the box denotes one standard error, and the lines on the boxes denote two standard errors. Lines on each plot represent the historical mean, dashed lines denote one standard deviation, and dotted lines denote two standard deviations.</w:t>
       </w:r>
     </w:p>
     <w:p>
@@ -265,7 +465,7 @@
           <wp:inline>
             <wp:extent cx="5334000" cy="6223000"/>
             <wp:effectExtent b="0" l="0" r="0" t="0"/>
-            <wp:docPr descr="Figure 3. Residual body condition index for Aleutian Islands groundfish species collected on the National Marine Fisheries Service (NMFS) Alaska Fisheries Science Center Resource Assessment and Conservation Engineering (AFSC/RACE) Groundfish Assessment Program (GAP) standard summer bottom trawl survey (1991–2026) grouped by International North Pacific Fisheries Commission (INPFC) statistical sampling strata." title="" id="29" name="Picture"/>
+            <wp:docPr descr="Figure 3. Length-weight residuals by survey subarea for seven Aleutian Islands groundfish species and age 1–2 walleye pollock (100–250 mm) sampled in the AFSC/RACE GAP standard summer bottom trawl survey, 1991-2026. Length-weight residuals are not weighted by subarea biomass." title="" id="29" name="Picture"/>
             <a:graphic>
               <a:graphicData uri="http://schemas.openxmlformats.org/drawingml/2006/picture">
                 <pic:pic>
@@ -308,7 +508,7 @@
         <w:pStyle w:val="ImageCaption"/>
       </w:pPr>
       <w:r>
-        <w:t xml:space="preserve">Figure 3. Residual body condition index for Aleutian Islands groundfish species collected on the National Marine Fisheries Service (NMFS) Alaska Fisheries Science Center Resource Assessment and Conservation Engineering (AFSC/RACE) Groundfish Assessment Program (GAP) standard summer bottom trawl survey (1991–2026) grouped by International North Pacific Fisheries Commission (INPFC) statistical sampling strata.</w:t>
+        <w:t xml:space="preserve">Figure 3. Length-weight residuals by survey subarea for seven Aleutian Islands groundfish species and age 1–2 walleye pollock (100–250 mm) sampled in the AFSC/RACE GAP standard summer bottom trawl survey, 1991-2026. Length-weight residuals are not weighted by subarea biomass.</w:t>
       </w:r>
     </w:p>
     <w:p>
@@ -317,13 +517,188 @@
       </w:pPr>
       <w:r>
         <w:rPr>
+          <w:bCs/>
           <w:b/>
+        </w:rPr>
+        <w:t xml:space="preserve">Factors causing observed trends</w:t>
+      </w:r>
+      <w:r>
+        <w:t xml:space="preserve">: Several factors could affect morphological condition, including water temperature. Since the Warm Blob in 2014</w:t>
+      </w:r>
+      <w:r>
+        <w:t xml:space="preserve"> </w:t>
+      </w:r>
+      <w:r>
+        <w:t xml:space="preserve">(Bond et al., 2015; Stabeno &amp; Bell, 2019)</w:t>
+      </w:r>
+      <w:r>
+        <w:t xml:space="preserve">, there has been a general trend of warming ocean temperatures in the survey area that could affect fish growth conditions. Summer sea surface temperatures in the Aleutian Islands hovered near the long-time mean in both 2024 and 2026 based on measurements recorded during the bottom trawl survey (Rohan &amp; Howard, this ESR). The influence of temperature on growth rates depends on the physiology of predator species, prey availability, and the adaptive capacity of predators to respond to environmental change through migration, changes in behavior, and acclimatization. For example, elevated temperatures during the 2014-2016 marine heatwave in the Gulf of Alaska led to lower growth rates and condition of Pacific cod and early life history stages of walleye pollock, likely because available prey resources did not make up for increased metabolic demand</w:t>
+      </w:r>
+      <w:r>
+        <w:t xml:space="preserve"> </w:t>
+      </w:r>
+      <w:r>
+        <w:t xml:space="preserve">(Barbeaux et al., 2020; Rogers et al., 2021)</w:t>
+      </w:r>
+      <w:r>
+        <w:t xml:space="preserve">. Density-dependent competition may also influence condition, as morphometric condition is expected to be high when a stock is at low abundance and low when a stock is at high abundance</w:t>
+      </w:r>
+      <w:r>
+        <w:t xml:space="preserve"> </w:t>
+      </w:r>
+      <w:r>
+        <w:t xml:space="preserve">(Haberle et al., 2023)</w:t>
+      </w:r>
+      <w:r>
+        <w:t xml:space="preserve">. Thus, the factors underpinning the negative or neutral condition remain unclear.</w:t>
+      </w:r>
+    </w:p>
+    <w:p>
+      <w:pPr>
+        <w:pStyle w:val="BodyText"/>
+      </w:pPr>
+      <w:r>
+        <w:t xml:space="preserve">Other factors that could affect morphological condition include survey timing, stomach fullness, and fish movement patterns</w:t>
+      </w:r>
+      <w:r>
+        <w:t xml:space="preserve"> </w:t>
+      </w:r>
+      <w:r>
+        <w:t xml:space="preserve">(Froese, 2006)</w:t>
+      </w:r>
+      <w:r>
+        <w:t xml:space="preserve">. Changing ocean conditions along with normal patterns of movement can cause the proportion of the population resident in the sampling area during the annual bottom trawl survey to vary. Effects of survey timing on body condition can be further compounded by seasonal fluctuations in reproductive status with the buildup and depletion of energy stores</w:t>
+      </w:r>
+      <w:r>
+        <w:t xml:space="preserve"> </w:t>
+      </w:r>
+      <w:r>
+        <w:t xml:space="preserve">(Wuenschel et al., 2019)</w:t>
+      </w:r>
+      <w:r>
+        <w:t xml:space="preserve">. Another consideration is that fish weights sampled at sea include gut content weights, so variation in gut fullness may influence weight measurements since feeding conditions, digestion, and gastric evacuation rates vary over space and time.</w:t>
+      </w:r>
+    </w:p>
+    <w:p>
+      <w:pPr>
+        <w:pStyle w:val="BodyText"/>
+      </w:pPr>
+      <w:r>
+        <w:t xml:space="preserve">Spatial heterogeneity within the Aleutian Islands may also influence morphometric condition. Fish community composition changes abruptly at several of the major passes between islands, and growth rates of some fish species decline toward the west</w:t>
+      </w:r>
+      <w:r>
+        <w:t xml:space="preserve"> </w:t>
+      </w:r>
+      <w:r>
+        <w:t xml:space="preserve">(Hunt &amp; Stabeno, 2005)</w:t>
+      </w:r>
+      <w:r>
+        <w:t xml:space="preserve">, as has been documented for Atka mackerel</w:t>
+      </w:r>
+      <w:r>
+        <w:t xml:space="preserve"> </w:t>
+      </w:r>
+      <w:r>
+        <w:t xml:space="preserve">(Rand et al., 2010)</w:t>
+      </w:r>
+      <w:r>
+        <w:t xml:space="preserve">.</w:t>
+      </w:r>
+      <w:r>
+        <w:t xml:space="preserve"> </w:t>
+      </w:r>
+      <w:r>
+        <w:t xml:space="preserve">O’Leary et al. (2026)</w:t>
+      </w:r>
+      <w:r>
+        <w:t xml:space="preserve"> </w:t>
+      </w:r>
+      <w:r>
+        <w:t xml:space="preserve">recently evaluated weight-at-length of six Aleutian groundfish species north and south of the Aleutian passes using survey data through 2022. Pacific ocean perch, northern rockfish, Pacific cod, and arrowtooth flounder were heavier for their length north of the passes, whereas Atka mackerel were heavier south of the passes, and walleye pollock showed no significant north-south difference; overall effect sizes were small. Because samples from both sides of the chain are combined to estimate subarea-specific regression parameters, north-south differences in weight-at-length are not accounted for in the current indicator and could contribute to variability in condition estimates, for example if the proportion of samples collected north versus south of the chain differs among years.</w:t>
+      </w:r>
+    </w:p>
+    <w:p>
+      <w:pPr>
+        <w:pStyle w:val="BodyText"/>
+      </w:pPr>
+      <w:r>
+        <w:t xml:space="preserve">Finally, although condition indicators characterize spatial and temporal variation in morphometric condition of groundfish species in the Aleutian Islands, they do not inform the mechanisms or processes behind the observed patterns.</w:t>
+      </w:r>
+    </w:p>
+    <w:p>
+      <w:pPr>
+        <w:pStyle w:val="BodyText"/>
+      </w:pPr>
+      <w:r>
+        <w:rPr>
           <w:bCs/>
-        </w:rPr>
-        <w:t xml:space="preserve">Factors causing observed trends</w:t>
-      </w:r>
-      <w:r>
-        <w:t xml:space="preserve">: Several factors could affect morphological condition, including water temperature. Since the Warm Blob in 2014</w:t>
+          <w:b/>
+        </w:rPr>
+        <w:t xml:space="preserve">Implications</w:t>
+      </w:r>
+      <w:r>
+        <w:t xml:space="preserve">: Fish morphometric condition can be considered an indicator of ecosystem productivity with implications for fish survival, maturity, and reproduction. For example, in Prince William Sound, the pre-winter condition of herring may determine their overwinter survival</w:t>
+      </w:r>
+      <w:r>
+        <w:t xml:space="preserve"> </w:t>
+      </w:r>
+      <w:r>
+        <w:t xml:space="preserve">(Paul &amp; Paul, 1999)</w:t>
+      </w:r>
+      <w:r>
+        <w:t xml:space="preserve">, differences in feeding conditions have been linked to differences in morphometric condition of pink salmon in Prince William Sound</w:t>
+      </w:r>
+      <w:r>
+        <w:t xml:space="preserve"> </w:t>
+      </w:r>
+      <w:r>
+        <w:t xml:space="preserve">(Boldt &amp; Haldorson, 2004)</w:t>
+      </w:r>
+      <w:r>
+        <w:t xml:space="preserve">. variation in morphometric condition has been linked to variation in maturity of sablefish</w:t>
+      </w:r>
+      <w:r>
+        <w:t xml:space="preserve"> </w:t>
+      </w:r>
+      <w:r>
+        <w:t xml:space="preserve">(Rodgveller, 2019)</w:t>
+      </w:r>
+      <w:r>
+        <w:t xml:space="preserve">, and lower morphometric condition of Pacific cod was associated with higher mortality and lower growth rates during the 2014–2016 marine heat wave in the Gulf of Alaska</w:t>
+      </w:r>
+      <w:r>
+        <w:t xml:space="preserve"> </w:t>
+      </w:r>
+      <w:r>
+        <w:t xml:space="preserve">(Barbeaux et al., 2020)</w:t>
+      </w:r>
+      <w:r>
+        <w:t xml:space="preserve">. Condition can also be an indicator of stock status relative to carrying capacity because morphometric condition is expected to be high when the stock is at low abundance and low when the stock is at high abundance because of the effects of density-dependent competition</w:t>
+      </w:r>
+      <w:r>
+        <w:t xml:space="preserve"> </w:t>
+      </w:r>
+      <w:r>
+        <w:t xml:space="preserve">(Haberle et al., 2023)</w:t>
+      </w:r>
+      <w:r>
+        <w:t xml:space="preserve">. Thus, the condition of Aleutian Islands groundfishes may provide insight into ecosystem productivity as well as fish survival, demographic status, and population health. However, survivorship is likely also affected by many factors not examined here.</w:t>
+      </w:r>
+    </w:p>
+    <w:p>
+      <w:pPr>
+        <w:pStyle w:val="BodyText"/>
+      </w:pPr>
+      <w:r>
+        <w:t xml:space="preserve">Another important consideration is that fish condition was computed for all sizes of fishes combined, except in the case of walleye pollock. Examining condition of early juvenile stage fishes separately from the condition of adult fishes could provide further insight into the value of length-weight residuals as an indicator of individual health or survivorship (Froese, 2006), particularly since juvenile and adult walleye pollock exhibited opposite trends in condition in the Aleutian Islands this year.</w:t>
+      </w:r>
+    </w:p>
+    <w:p>
+      <w:pPr>
+        <w:pStyle w:val="BodyText"/>
+      </w:pPr>
+      <w:r>
+        <w:t xml:space="preserve">The decreasing trend in body condition for many Aleutian Islands species suggests growth has decreased, which may have implications for stock assessment. The condition of northern rockfish and Pacific ocean perch, two long-lived and highly abundant planktivores, reached their lowest values in the time series in 2026. Downward trends in body condition could indicate poor overwinter survival or may reflect the influence of locally changing environmental conditions depressing fish growth, local production, or survivorship. Indications are that the 2014–2016 marine heatwave</w:t>
       </w:r>
       <w:r>
         <w:t xml:space="preserve"> </w:t>
@@ -332,7 +707,10 @@
         <w:t xml:space="preserve">(Bond et al., 2015; Stabeno &amp; Bell, 2019)</w:t>
       </w:r>
       <w:r>
-        <w:t xml:space="preserve">, there has been a general trend of warming ocean temperatures in the survey area through 2022 that could affect fish growth conditions there. The influence of temperature on growth rates depends on the physiology of predator species, prey availability, and the adaptive capacity of predators to respond to environmental change through migration, changes in behavior, and acclimatization. Thus, the factors underpinning the negative or neutral condition remain unclear.</w:t>
+        <w:t xml:space="preserve"> </w:t>
+      </w:r>
+      <w:r>
+        <w:t xml:space="preserve">has been followed by years with elevated water temperatures, which may be related to changes in fish condition in the species examined.</w:t>
       </w:r>
     </w:p>
     <w:p>
@@ -340,196 +718,50 @@
         <w:pStyle w:val="BodyText"/>
       </w:pPr>
       <w:r>
-        <w:t xml:space="preserve">Other factors that could affect morphological condition include survey timing, stomach fullness, fish movement patterns, sex, and environmental conditions</w:t>
-      </w:r>
-      <w:r>
-        <w:t xml:space="preserve"> </w:t>
-      </w:r>
-      <w:r>
-        <w:t xml:space="preserve">(Froese, 2006)</w:t>
-      </w:r>
-      <w:r>
-        <w:t xml:space="preserve">. Changing ocean conditions along with normal patterns of movement can cause the proportion of the population resident in the sampling area during the annual bottom trawl survey to vary. The date that the first length-weight data are collected is generally in the beginning of June and the bottom trawl survey is conducted throughout the summer months moving from east to west so that spatial and temporal trends in fish growth over the season become confounded with survey progress. We can expect some fish to exhibit seasonal or ontogenetic movement patterns during the survey months. Effects of survey timing on body condition can be further compounded by seasonal fluctuations in reproductive condition with the buildup and depletion of energy stores</w:t>
-      </w:r>
-      <w:r>
-        <w:t xml:space="preserve"> </w:t>
-      </w:r>
-      <w:r>
-        <w:t xml:space="preserve">(Wuenschel et al., 2019)</w:t>
-      </w:r>
-      <w:r>
-        <w:t xml:space="preserve">. Another consideration is that fish weights sampled at sea include gut content weights so variation in gut fullness may influence weight measurements. Since feeding conditions vary over space and time, prey consumption rates and the proportion of total body weight attributable to gut contents may also be an important factor influencing length-at-weight.</w:t>
-      </w:r>
-    </w:p>
-    <w:p>
-      <w:pPr>
-        <w:pStyle w:val="BodyText"/>
-      </w:pPr>
-      <w:r>
-        <w:t xml:space="preserve">Finally, although condition indicators characterizes spatial and temporal variation in morphometric condition of groundfish species in the Aleutian Islands, it does not inform the mechanisms or processes behind the observed patterns.</w:t>
-      </w:r>
-    </w:p>
-    <w:p>
-      <w:pPr>
-        <w:pStyle w:val="BodyText"/>
-      </w:pPr>
-      <w:r>
-        <w:rPr>
+        <w:rPr>
+          <w:bCs/>
           <w:b/>
-          <w:bCs/>
-        </w:rPr>
-        <w:t xml:space="preserve">Implications</w:t>
-      </w:r>
-      <w:r>
-        <w:t xml:space="preserve">: Fish morphometric condition can be considered an indicator of ecosystem productivity with implications for fish survival, maturity, and reproduction. For example, in Prince William Sound, the pre-winter condition of herring may determine their overwinter survival</w:t>
-      </w:r>
-      <w:r>
-        <w:t xml:space="preserve"> </w:t>
-      </w:r>
-      <w:r>
-        <w:t xml:space="preserve">(Paul &amp; Paul, 1999)</w:t>
-      </w:r>
-      <w:r>
-        <w:t xml:space="preserve">, differences in feeding conditions have been linked to differences in morphometric condition of pink salmon in Prince William Sound</w:t>
-      </w:r>
-      <w:r>
-        <w:t xml:space="preserve"> </w:t>
-      </w:r>
-      <w:r>
-        <w:t xml:space="preserve">(Boldt &amp; Haldorson, 2004)</w:t>
-      </w:r>
-      <w:r>
-        <w:t xml:space="preserve">, variation in morphometric condition has been linked to variation in maturity of sablefish</w:t>
-      </w:r>
-      <w:r>
-        <w:t xml:space="preserve"> </w:t>
-      </w:r>
-      <w:r>
-        <w:t xml:space="preserve">(Rodgveller, 2019)</w:t>
-      </w:r>
-      <w:r>
-        <w:t xml:space="preserve">, and lower morphometric condition of Pacific cod was associated with higher mortality and lower growth rates during the 2014–2016 marine heat wave in the Gulf of Alaska</w:t>
-      </w:r>
-      <w:r>
-        <w:t xml:space="preserve"> </w:t>
-      </w:r>
-      <w:r>
-        <w:t xml:space="preserve">(Barbeaux et al., 2020)</w:t>
-      </w:r>
-      <w:r>
-        <w:t xml:space="preserve">. The condition of Aleutian Islands groundfish may similarly contribute to survival and recruitment and provide insight into ecosystem productivity, fish survival, demographic status, and population health. The condition of Aleutian Islands groundfish may similarly contribute to survival and recruitment and provide insight into ecosystem productivity, fish survival, demographic status, and population health.</w:t>
-      </w:r>
-    </w:p>
-    <w:p>
-      <w:pPr>
-        <w:pStyle w:val="BodyText"/>
-      </w:pPr>
-      <w:r>
-        <w:t xml:space="preserve">Survivorship is likely affected by many factors not examined here. As future years are added to the time series, the relationship between length-weight residuals and subsequent survival will be examined further. It is important to consider that residual body condition for most species in these analyses was computed for all sizes and sexes combined. Requirements for growth and survivorship differ for different fish life stages and some species have sexually dimorphic growth patterns. It may be more informative to examine life-stage (e.g., early juvenile, subadult, and adult phases) and sex specific body condition in the future for more insight into individual health and survivorship</w:t>
-      </w:r>
-      <w:r>
-        <w:t xml:space="preserve"> </w:t>
-      </w:r>
-      <w:r>
-        <w:t xml:space="preserve">(Froese, 2006)</w:t>
+        </w:rPr>
+        <w:t xml:space="preserve">Research priorities</w:t>
+      </w:r>
+      <w:r>
+        <w:t xml:space="preserve">: Research is underway at the AFSC to examine relationships among putatively similar indicators of fish condition (i.e., morphometric, bioenergetic, physiological). This includes an evaluation of hepatosomatic index, microwave energy meter (fatmeter) measurements, and Fourier-transform near-infrared (FT-NIR) spectroscopy as alternative condition indicators, compared against biochemical measurements of liver lipid content (Prohaska et al., in prep.). Depending on the outcome of this work and the feasibility of collecting the required measurements during surveys, these indicators may be incorporated into future Ecosystem Status Reports (ESRs).</w:t>
+      </w:r>
+    </w:p>
+    <w:bookmarkStart w:id="58" w:name="references"/>
+    <w:p>
+      <w:pPr>
+        <w:pStyle w:val="Heading2"/>
+      </w:pPr>
+      <w:r>
+        <w:t xml:space="preserve">References</w:t>
+      </w:r>
+    </w:p>
+    <w:bookmarkStart w:id="57" w:name="refs"/>
+    <w:bookmarkStart w:id="32" w:name="ref-Barbeaux2020"/>
+    <w:p>
+      <w:pPr>
+        <w:pStyle w:val="Bibliography"/>
+      </w:pPr>
+      <w:r>
+        <w:t xml:space="preserve">Barbeaux, S. J., Holsman, K., &amp; Zador, S. (2020).</w:t>
+      </w:r>
+      <w:r>
+        <w:t xml:space="preserve"> </w:t>
+      </w:r>
+      <w:r>
+        <w:t xml:space="preserve">Marine heatwave stress test of ecosystem-based fisheries management in the Gulf of Alaska Pacific cod fishery</w:t>
       </w:r>
       <w:r>
         <w:t xml:space="preserve">.</w:t>
       </w:r>
-    </w:p>
-    <w:p>
-      <w:pPr>
-        <w:pStyle w:val="BodyText"/>
-      </w:pPr>
-      <w:r>
-        <w:t xml:space="preserve">The trend toward lowered body condition for many Aleutian Islands species from 2010 to 2018 RACE/AFSC GAP bottom trawl surveys (i.e., increasingly negative length-weight residuals) is a potential cause for concern. However, the increase in body condition for all groundfish species in 2022 may portend a reversal of the trend. Recent downward trends in body condition could indicate poor overwinter survival or may reflect the influence of locally changing environmental conditions depressing fish growth, local production, or survivorship. Indications are that the Warm Blob</w:t>
-      </w:r>
-      <w:r>
-        <w:t xml:space="preserve"> </w:t>
-      </w:r>
-      <w:r>
-        <w:t xml:space="preserve">(Bond et al., 2015; Stabeno &amp; Bell, 2019)</w:t>
-      </w:r>
-      <w:r>
-        <w:t xml:space="preserve"> </w:t>
-      </w:r>
-      <w:r>
-        <w:t xml:space="preserve">has been followed by years with elevated water temperatures</w:t>
-      </w:r>
-      <w:r>
-        <w:t xml:space="preserve"> </w:t>
-      </w:r>
-      <w:r>
-        <w:t xml:space="preserve">(e.g.,</w:t>
-      </w:r>
-      <w:r>
-        <w:t xml:space="preserve"> </w:t>
-      </w:r>
-      <w:r>
-        <w:t xml:space="preserve">Barbeaux et al. (2020)</w:t>
-      </w:r>
-      <w:r>
-        <w:t xml:space="preserve">) which may be related to changes in fish condition in the species examined. As we continue to add years of fish condition to the record and expand on our knowledge of the relationships between condition, growth, production, and survival, we hope to gain more insight into the overall health of fish populations in the Aleutian Islands.</w:t>
-      </w:r>
-    </w:p>
-    <w:p>
-      <w:pPr>
-        <w:pStyle w:val="BodyText"/>
-      </w:pPr>
-      <w:r>
-        <w:rPr>
-          <w:b/>
-          <w:bCs/>
-        </w:rPr>
-        <w:t xml:space="preserve">Research priorities</w:t>
-      </w:r>
-      <w:r>
-        <w:t xml:space="preserve">: The new model-based condition indicator (VAST relative condition) will be further explored for biases and sensitivities to data, model structure, and parameterization. Specifically, the 100-250 mm walleye pollock VAST relative condition indicator model does not converge, and so further model structure and parameterization research is needed. Research is also being planned and implemented across multiple AFSC programs to explore standardization of statistical methods for calculating condition indicators, and to examine relationships among putatively similar indicators of fish condition (i.e., morphometric, bioenergetic, physiological). Finally, we plan to explore variation in condition indices between life history stages alongside density dependence and climate change impacts</w:t>
-      </w:r>
-      <w:r>
-        <w:t xml:space="preserve"> </w:t>
-      </w:r>
-      <w:r>
-        <w:t xml:space="preserve">(Bolin et al., 2021; Oke et al., 2022)</w:t>
-      </w:r>
-      <w:r>
-        <w:t xml:space="preserve">.</w:t>
-      </w:r>
-    </w:p>
-    <w:bookmarkStart w:id="54" w:name="references"/>
-    <w:p>
-      <w:pPr>
-        <w:pStyle w:val="Heading2"/>
-      </w:pPr>
-      <w:r>
-        <w:t xml:space="preserve">References</w:t>
-      </w:r>
-    </w:p>
-    <w:bookmarkStart w:id="53" w:name="refs"/>
-    <w:bookmarkStart w:id="32" w:name="ref-Barbeaux2020"/>
-    <w:p>
-      <w:pPr>
-        <w:pStyle w:val="Bibliography"/>
-      </w:pPr>
-      <w:r>
-        <w:t xml:space="preserve">Barbeaux, S. J., Holsman, K., &amp; Zador, S. (2020).</w:t>
-      </w:r>
-      <w:r>
-        <w:t xml:space="preserve"> </w:t>
-      </w:r>
-      <w:r>
-        <w:t xml:space="preserve">Marine heatwave stress test of ecosystem-based fisheries management in the Gulf of Alaska Pacific cod fishery</w:t>
-      </w:r>
-      <w:r>
-        <w:t xml:space="preserve">.</w:t>
-      </w:r>
-      <w:r>
-        <w:t xml:space="preserve"> </w:t>
-      </w:r>
-      <w:r>
-        <w:rPr>
-          <w:i/>
-          <w:iCs/>
+      <w:r>
+        <w:t xml:space="preserve"> </w:t>
+      </w:r>
+      <w:r>
+        <w:rPr>
+          <w:iCs/>
+          <w:i/>
         </w:rPr>
         <w:t xml:space="preserve">Frontiers in Marine Science</w:t>
       </w:r>
@@ -541,8 +773,8 @@
       </w:r>
       <w:r>
         <w:rPr>
-          <w:i/>
-          <w:iCs/>
+          <w:iCs/>
+          <w:i/>
         </w:rPr>
         <w:t xml:space="preserve">7</w:t>
       </w:r>
@@ -562,19 +794,19 @@
       </w:hyperlink>
     </w:p>
     <w:bookmarkEnd w:id="32"/>
-    <w:bookmarkStart w:id="34" w:name="ref-Blackwell2000"/>
+    <w:bookmarkStart w:id="34" w:name="ref-Boldt2004"/>
     <w:p>
       <w:pPr>
         <w:pStyle w:val="Bibliography"/>
       </w:pPr>
       <w:r>
-        <w:t xml:space="preserve">Blackwell, B. G., Brown, M. L., &amp; Willis, D. W. (2000).</w:t>
-      </w:r>
-      <w:r>
-        <w:t xml:space="preserve"> </w:t>
-      </w:r>
-      <w:r>
-        <w:t xml:space="preserve">Relative weight (Wr) status and current use in fisheries assessment and management</w:t>
+        <w:t xml:space="preserve">Boldt, J. L., &amp; Haldorson, L. J. (2004).</w:t>
+      </w:r>
+      <w:r>
+        <w:t xml:space="preserve"> </w:t>
+      </w:r>
+      <w:r>
+        <w:t xml:space="preserve">Size and condition of wild and hatchery pink salmon juveniles in Prince William Sound, Alaska</w:t>
       </w:r>
       <w:r>
         <w:t xml:space="preserve">.</w:t>
@@ -584,10 +816,10 @@
       </w:r>
       <w:r>
         <w:rPr>
-          <w:i/>
-          <w:iCs/>
-        </w:rPr>
-        <w:t xml:space="preserve">Reviews in Fisheries Science</w:t>
+          <w:iCs/>
+          <w:i/>
+        </w:rPr>
+        <w:t xml:space="preserve">Transactions of the American Fisheries Society</w:t>
       </w:r>
       <w:r>
         <w:t xml:space="preserve">,</w:t>
@@ -597,74 +829,18 @@
       </w:r>
       <w:r>
         <w:rPr>
-          <w:i/>
-          <w:iCs/>
-        </w:rPr>
-        <w:t xml:space="preserve">8</w:t>
-      </w:r>
-      <w:r>
-        <w:t xml:space="preserve">(1), 1–44.</w:t>
+          <w:iCs/>
+          <w:i/>
+        </w:rPr>
+        <w:t xml:space="preserve">133</w:t>
+      </w:r>
+      <w:r>
+        <w:t xml:space="preserve">(1), 173–184.</w:t>
       </w:r>
       <w:r>
         <w:t xml:space="preserve"> </w:t>
       </w:r>
       <w:hyperlink r:id="rId33">
-        <w:r>
-          <w:rPr>
-            <w:rStyle w:val="Hyperlink"/>
-          </w:rPr>
-          <w:t xml:space="preserve">https://doi.org/10.1080/10641260091129161</w:t>
-        </w:r>
-      </w:hyperlink>
-    </w:p>
-    <w:bookmarkEnd w:id="34"/>
-    <w:bookmarkStart w:id="36" w:name="ref-Boldt2004"/>
-    <w:p>
-      <w:pPr>
-        <w:pStyle w:val="Bibliography"/>
-      </w:pPr>
-      <w:r>
-        <w:t xml:space="preserve">Boldt, J. L., &amp; Haldorson, L. J. (2004).</w:t>
-      </w:r>
-      <w:r>
-        <w:t xml:space="preserve"> </w:t>
-      </w:r>
-      <w:r>
-        <w:t xml:space="preserve">Size and condition of wild and hatchery pink salmon juveniles in Prince William Sound, Alaska</w:t>
-      </w:r>
-      <w:r>
-        <w:t xml:space="preserve">.</w:t>
-      </w:r>
-      <w:r>
-        <w:t xml:space="preserve"> </w:t>
-      </w:r>
-      <w:r>
-        <w:rPr>
-          <w:i/>
-          <w:iCs/>
-        </w:rPr>
-        <w:t xml:space="preserve">Transactions of the American Fisheries Society</w:t>
-      </w:r>
-      <w:r>
-        <w:t xml:space="preserve">,</w:t>
-      </w:r>
-      <w:r>
-        <w:t xml:space="preserve"> </w:t>
-      </w:r>
-      <w:r>
-        <w:rPr>
-          <w:i/>
-          <w:iCs/>
-        </w:rPr>
-        <w:t xml:space="preserve">133</w:t>
-      </w:r>
-      <w:r>
-        <w:t xml:space="preserve">(1), 173–184.</w:t>
-      </w:r>
-      <w:r>
-        <w:t xml:space="preserve"> </w:t>
-      </w:r>
-      <w:hyperlink r:id="rId35">
         <w:r>
           <w:rPr>
             <w:rStyle w:val="Hyperlink"/>
@@ -673,20 +849,20 @@
         </w:r>
       </w:hyperlink>
     </w:p>
-    <w:bookmarkEnd w:id="36"/>
-    <w:bookmarkStart w:id="38" w:name="ref-Bolin2021"/>
+    <w:bookmarkEnd w:id="34"/>
+    <w:bookmarkStart w:id="36" w:name="ref-Bond2015"/>
     <w:p>
       <w:pPr>
         <w:pStyle w:val="Bibliography"/>
       </w:pPr>
       <w:r>
-        <w:t xml:space="preserve">Bolin, J. A., Schoeman, D. S., Evans, K. J., Cummins, S. F., &amp; Scales, K. L. (2021).</w:t>
-      </w:r>
-      <w:r>
-        <w:t xml:space="preserve"> </w:t>
-      </w:r>
-      <w:r>
-        <w:t xml:space="preserve">Achieving sustainable and climate‐resilient fisheries requires marine ecosystem forecasts to include fish condition</w:t>
+        <w:t xml:space="preserve">Bond, N. A., Cronin, M. F., Freeland, H., &amp; Mantua, N. (2015).</w:t>
+      </w:r>
+      <w:r>
+        <w:t xml:space="preserve"> </w:t>
+      </w:r>
+      <w:r>
+        <w:t xml:space="preserve">Causes and impacts of the 2014 warm anomaly in the NE Pacific</w:t>
       </w:r>
       <w:r>
         <w:t xml:space="preserve">.</w:t>
@@ -696,10 +872,10 @@
       </w:r>
       <w:r>
         <w:rPr>
-          <w:i/>
-          <w:iCs/>
-        </w:rPr>
-        <w:t xml:space="preserve">Fish and Fisheries</w:t>
+          <w:iCs/>
+          <w:i/>
+        </w:rPr>
+        <w:t xml:space="preserve">Geophysical Research Letters</w:t>
       </w:r>
       <w:r>
         <w:t xml:space="preserve">,</w:t>
@@ -709,64 +885,8 @@
       </w:r>
       <w:r>
         <w:rPr>
-          <w:i/>
-          <w:iCs/>
-        </w:rPr>
-        <w:t xml:space="preserve">22</w:t>
-      </w:r>
-      <w:r>
-        <w:t xml:space="preserve">(5), 1067–1084.</w:t>
-      </w:r>
-      <w:r>
-        <w:t xml:space="preserve"> </w:t>
-      </w:r>
-      <w:hyperlink r:id="rId37">
-        <w:r>
-          <w:rPr>
-            <w:rStyle w:val="Hyperlink"/>
-          </w:rPr>
-          <w:t xml:space="preserve">https://doi.org/10.1111/faf.12569</w:t>
-        </w:r>
-      </w:hyperlink>
-    </w:p>
-    <w:bookmarkEnd w:id="38"/>
-    <w:bookmarkStart w:id="40" w:name="ref-Bond2015"/>
-    <w:p>
-      <w:pPr>
-        <w:pStyle w:val="Bibliography"/>
-      </w:pPr>
-      <w:r>
-        <w:t xml:space="preserve">Bond, N. A., Cronin, M. F., Freeland, H., &amp; Mantua, N. (2015).</w:t>
-      </w:r>
-      <w:r>
-        <w:t xml:space="preserve"> </w:t>
-      </w:r>
-      <w:r>
-        <w:t xml:space="preserve">Causes and impacts of the 2014 warm anomaly in the NE Pacific</w:t>
-      </w:r>
-      <w:r>
-        <w:t xml:space="preserve">.</w:t>
-      </w:r>
-      <w:r>
-        <w:t xml:space="preserve"> </w:t>
-      </w:r>
-      <w:r>
-        <w:rPr>
-          <w:i/>
-          <w:iCs/>
-        </w:rPr>
-        <w:t xml:space="preserve">Geophysical Research Letters</w:t>
-      </w:r>
-      <w:r>
-        <w:t xml:space="preserve">,</w:t>
-      </w:r>
-      <w:r>
-        <w:t xml:space="preserve"> </w:t>
-      </w:r>
-      <w:r>
-        <w:rPr>
-          <w:i/>
-          <w:iCs/>
+          <w:iCs/>
+          <w:i/>
         </w:rPr>
         <w:t xml:space="preserve">42</w:t>
       </w:r>
@@ -776,7 +896,7 @@
       <w:r>
         <w:t xml:space="preserve"> </w:t>
       </w:r>
-      <w:hyperlink r:id="rId39">
+      <w:hyperlink r:id="rId35">
         <w:r>
           <w:rPr>
             <w:rStyle w:val="Hyperlink"/>
@@ -785,8 +905,8 @@
         </w:r>
       </w:hyperlink>
     </w:p>
-    <w:bookmarkEnd w:id="40"/>
-    <w:bookmarkStart w:id="42" w:name="ref-Froese2006"/>
+    <w:bookmarkEnd w:id="36"/>
+    <w:bookmarkStart w:id="38" w:name="ref-Froese2006"/>
     <w:p>
       <w:pPr>
         <w:pStyle w:val="Bibliography"/>
@@ -808,8 +928,8 @@
       </w:r>
       <w:r>
         <w:rPr>
-          <w:i/>
-          <w:iCs/>
+          <w:iCs/>
+          <w:i/>
         </w:rPr>
         <w:t xml:space="preserve">Journal of Applied Ichthyology</w:t>
       </w:r>
@@ -821,8 +941,8 @@
       </w:r>
       <w:r>
         <w:rPr>
-          <w:i/>
-          <w:iCs/>
+          <w:iCs/>
+          <w:i/>
         </w:rPr>
         <w:t xml:space="preserve">22</w:t>
       </w:r>
@@ -832,7 +952,7 @@
       <w:r>
         <w:t xml:space="preserve"> </w:t>
       </w:r>
-      <w:hyperlink r:id="rId41">
+      <w:hyperlink r:id="rId37">
         <w:r>
           <w:rPr>
             <w:rStyle w:val="Hyperlink"/>
@@ -841,20 +961,132 @@
         </w:r>
       </w:hyperlink>
     </w:p>
+    <w:bookmarkEnd w:id="38"/>
+    <w:bookmarkStart w:id="40" w:name="ref-Haberle2023"/>
+    <w:p>
+      <w:pPr>
+        <w:pStyle w:val="Bibliography"/>
+      </w:pPr>
+      <w:r>
+        <w:t xml:space="preserve">Haberle, I., Bavčević, L., &amp; Klanjscek, T. (2023).</w:t>
+      </w:r>
+      <w:r>
+        <w:t xml:space="preserve"> </w:t>
+      </w:r>
+      <w:r>
+        <w:t xml:space="preserve">Fish condition as an indicator of stock status: Insights from condition index in a food‐limiting environment</w:t>
+      </w:r>
+      <w:r>
+        <w:t xml:space="preserve">.</w:t>
+      </w:r>
+      <w:r>
+        <w:t xml:space="preserve"> </w:t>
+      </w:r>
+      <w:r>
+        <w:rPr>
+          <w:iCs/>
+          <w:i/>
+        </w:rPr>
+        <w:t xml:space="preserve">Fish and Fisheries</w:t>
+      </w:r>
+      <w:r>
+        <w:t xml:space="preserve">,</w:t>
+      </w:r>
+      <w:r>
+        <w:t xml:space="preserve"> </w:t>
+      </w:r>
+      <w:r>
+        <w:rPr>
+          <w:iCs/>
+          <w:i/>
+        </w:rPr>
+        <w:t xml:space="preserve">24</w:t>
+      </w:r>
+      <w:r>
+        <w:t xml:space="preserve">(4), 567–581.</w:t>
+      </w:r>
+      <w:r>
+        <w:t xml:space="preserve"> </w:t>
+      </w:r>
+      <w:hyperlink r:id="rId39">
+        <w:r>
+          <w:rPr>
+            <w:rStyle w:val="Hyperlink"/>
+          </w:rPr>
+          <w:t xml:space="preserve">https://doi.org/10.1111/faf.12744</w:t>
+        </w:r>
+      </w:hyperlink>
+    </w:p>
+    <w:bookmarkEnd w:id="40"/>
+    <w:bookmarkStart w:id="42" w:name="ref-Hunt2005"/>
+    <w:p>
+      <w:pPr>
+        <w:pStyle w:val="Bibliography"/>
+      </w:pPr>
+      <w:r>
+        <w:t xml:space="preserve">Hunt, G. L. Jr., &amp; Stabeno, P. J. (2005).</w:t>
+      </w:r>
+      <w:r>
+        <w:t xml:space="preserve"> </w:t>
+      </w:r>
+      <w:r>
+        <w:t xml:space="preserve">Oceanography and ecology of the Aleutian Archipelago: spatial and temporal variation</w:t>
+      </w:r>
+      <w:r>
+        <w:t xml:space="preserve">.</w:t>
+      </w:r>
+      <w:r>
+        <w:t xml:space="preserve"> </w:t>
+      </w:r>
+      <w:r>
+        <w:rPr>
+          <w:iCs/>
+          <w:i/>
+        </w:rPr>
+        <w:t xml:space="preserve">Fisheries Oceanography</w:t>
+      </w:r>
+      <w:r>
+        <w:t xml:space="preserve">,</w:t>
+      </w:r>
+      <w:r>
+        <w:t xml:space="preserve"> </w:t>
+      </w:r>
+      <w:r>
+        <w:rPr>
+          <w:iCs/>
+          <w:i/>
+        </w:rPr>
+        <w:t xml:space="preserve">14</w:t>
+      </w:r>
+      <w:r>
+        <w:t xml:space="preserve">(Suppl. 1), 292–306.</w:t>
+      </w:r>
+      <w:r>
+        <w:t xml:space="preserve"> </w:t>
+      </w:r>
+      <w:hyperlink r:id="rId41">
+        <w:r>
+          <w:rPr>
+            <w:rStyle w:val="Hyperlink"/>
+          </w:rPr>
+          <w:t xml:space="preserve">https://doi.org/10.1111/j.1365-2419.2005.00378.x</w:t>
+        </w:r>
+      </w:hyperlink>
+    </w:p>
     <w:bookmarkEnd w:id="42"/>
-    <w:bookmarkStart w:id="44" w:name="ref-Oke2022"/>
+    <w:bookmarkStart w:id="44" w:name="ref-Oleary2026"/>
     <w:p>
       <w:pPr>
         <w:pStyle w:val="Bibliography"/>
       </w:pPr>
       <w:r>
-        <w:t xml:space="preserve">Oke, K. B., Mueter, F. J., &amp; Litzow, M. A. (2022).</w:t>
-      </w:r>
-      <w:r>
-        <w:t xml:space="preserve"> </w:t>
-      </w:r>
-      <w:r>
-        <w:t xml:space="preserve">Warming leads to opposite patterns in weight-at-age for young versus old age classes of Bering Sea walleye pollock</w:t>
+        <w:t xml:space="preserve">O’Leary, A., Cecilia, Zimmerman, M., &amp; Prescott, M. (2026).</w:t>
+      </w:r>
+      <w:r>
+        <w:t xml:space="preserve"> </w:t>
+      </w:r>
+      <w:r>
+        <w:t xml:space="preserve">Spatial Heterogeneity in the Aleutian Islands Influences Groundfish Morphometric Condition Rationale</w:t>
       </w:r>
       <w:r>
         <w:t xml:space="preserve">.</w:t>
@@ -864,13 +1096,26 @@
       </w:r>
       <w:r>
         <w:rPr>
-          <w:i/>
-          <w:iCs/>
-        </w:rPr>
-        <w:t xml:space="preserve">Canadian Journal of Fisheries and Aquatic Sciences</w:t>
-      </w:r>
-      <w:r>
-        <w:t xml:space="preserve">.</w:t>
+          <w:iCs/>
+          <w:i/>
+        </w:rPr>
+        <w:t xml:space="preserve">Fisheries Oceanography</w:t>
+      </w:r>
+      <w:r>
+        <w:t xml:space="preserve">,</w:t>
+      </w:r>
+      <w:r>
+        <w:t xml:space="preserve"> </w:t>
+      </w:r>
+      <w:r>
+        <w:rPr>
+          <w:iCs/>
+          <w:i/>
+        </w:rPr>
+        <w:t xml:space="preserve">35</w:t>
+      </w:r>
+      <w:r>
+        <w:t xml:space="preserve">(6), 880–890.</w:t>
       </w:r>
       <w:r>
         <w:t xml:space="preserve"> </w:t>
@@ -880,7 +1125,7 @@
           <w:rPr>
             <w:rStyle w:val="Hyperlink"/>
           </w:rPr>
-          <w:t xml:space="preserve">https://doi.org/10.1139/cjfas-2021-0315</w:t>
+          <w:t xml:space="preserve">https://doi.org/10.1111/fog.70062</w:t>
         </w:r>
       </w:hyperlink>
     </w:p>
@@ -907,8 +1152,8 @@
       </w:r>
       <w:r>
         <w:rPr>
-          <w:i/>
-          <w:iCs/>
+          <w:iCs/>
+          <w:i/>
         </w:rPr>
         <w:t xml:space="preserve">Journal of Fish Biology</w:t>
       </w:r>
@@ -920,8 +1165,8 @@
       </w:r>
       <w:r>
         <w:rPr>
-          <w:i/>
-          <w:iCs/>
+          <w:iCs/>
+          <w:i/>
         </w:rPr>
         <w:t xml:space="preserve">54</w:t>
       </w:r>
@@ -941,12 +1186,68 @@
       </w:hyperlink>
     </w:p>
     <w:bookmarkEnd w:id="46"/>
-    <w:bookmarkStart w:id="48" w:name="ref-Rodgveller2019"/>
+    <w:bookmarkStart w:id="48" w:name="ref-Rand2010"/>
     <w:p>
       <w:pPr>
         <w:pStyle w:val="Bibliography"/>
       </w:pPr>
       <w:r>
+        <w:t xml:space="preserve">Rand, K. M., Beauchamp, A., David, &amp; Lowe, A., Sandra. (2010).</w:t>
+      </w:r>
+      <w:r>
+        <w:t xml:space="preserve"> </w:t>
+      </w:r>
+      <w:r>
+        <w:t xml:space="preserve">Longitudinal Growth Differences and the Influence of Diet Quality on Atka Mackerel of the Aleutian Islands, Alaska: Using a Bioenergetics Model to Explore Underlying Mechanisms</w:t>
+      </w:r>
+      <w:r>
+        <w:t xml:space="preserve">.</w:t>
+      </w:r>
+      <w:r>
+        <w:t xml:space="preserve"> </w:t>
+      </w:r>
+      <w:r>
+        <w:rPr>
+          <w:iCs/>
+          <w:i/>
+        </w:rPr>
+        <w:t xml:space="preserve">Marine and Coastal Fisheries</w:t>
+      </w:r>
+      <w:r>
+        <w:t xml:space="preserve">,</w:t>
+      </w:r>
+      <w:r>
+        <w:t xml:space="preserve"> </w:t>
+      </w:r>
+      <w:r>
+        <w:rPr>
+          <w:iCs/>
+          <w:i/>
+        </w:rPr>
+        <w:t xml:space="preserve">2</w:t>
+      </w:r>
+      <w:r>
+        <w:t xml:space="preserve">(1), 362–374.</w:t>
+      </w:r>
+      <w:r>
+        <w:t xml:space="preserve"> </w:t>
+      </w:r>
+      <w:hyperlink r:id="rId47">
+        <w:r>
+          <w:rPr>
+            <w:rStyle w:val="Hyperlink"/>
+          </w:rPr>
+          <w:t xml:space="preserve">https://doi.org/10.1577/C09-046.1</w:t>
+        </w:r>
+      </w:hyperlink>
+    </w:p>
+    <w:bookmarkEnd w:id="48"/>
+    <w:bookmarkStart w:id="50" w:name="ref-Rodgveller2019"/>
+    <w:p>
+      <w:pPr>
+        <w:pStyle w:val="Bibliography"/>
+      </w:pPr>
+      <w:r>
         <w:t xml:space="preserve">Rodgveller, C. J. (2019).</w:t>
       </w:r>
       <w:r>
@@ -963,8 +1264,8 @@
       </w:r>
       <w:r>
         <w:rPr>
-          <w:i/>
-          <w:iCs/>
+          <w:iCs/>
+          <w:i/>
         </w:rPr>
         <w:t xml:space="preserve">Fisheries Research</w:t>
       </w:r>
@@ -976,8 +1277,8 @@
       </w:r>
       <w:r>
         <w:rPr>
-          <w:i/>
-          <w:iCs/>
+          <w:iCs/>
+          <w:i/>
         </w:rPr>
         <w:t xml:space="preserve">216</w:t>
       </w:r>
@@ -987,7 +1288,7 @@
       <w:r>
         <w:t xml:space="preserve"> </w:t>
       </w:r>
-      <w:hyperlink r:id="rId47">
+      <w:hyperlink r:id="rId49">
         <w:r>
           <w:rPr>
             <w:rStyle w:val="Hyperlink"/>
@@ -996,13 +1297,78 @@
         </w:r>
       </w:hyperlink>
     </w:p>
-    <w:bookmarkEnd w:id="48"/>
-    <w:bookmarkStart w:id="50" w:name="ref-Stabeno2019a"/>
+    <w:bookmarkEnd w:id="50"/>
+    <w:bookmarkStart w:id="52" w:name="ref-Rogers2021"/>
     <w:p>
       <w:pPr>
         <w:pStyle w:val="Bibliography"/>
       </w:pPr>
       <w:r>
+        <w:t xml:space="preserve">Rogers, L. A., Wilson, M. T., Duffy-Anderson, J. T., Kimmel, D. G., &amp; Lamb, J. F. (2021).</w:t>
+      </w:r>
+      <w:r>
+        <w:t xml:space="preserve"> </w:t>
+      </w:r>
+      <w:r>
+        <w:t xml:space="preserve">Pollock and</w:t>
+      </w:r>
+      <w:r>
+        <w:t xml:space="preserve"> </w:t>
+      </w:r>
+      <w:r>
+        <w:t xml:space="preserve">“the Blob”</w:t>
+      </w:r>
+      <w:r>
+        <w:t xml:space="preserve">: Impacts of a marine heatwave on walleye pollock early life stages</w:t>
+      </w:r>
+      <w:r>
+        <w:t xml:space="preserve">.</w:t>
+      </w:r>
+      <w:r>
+        <w:t xml:space="preserve"> </w:t>
+      </w:r>
+      <w:r>
+        <w:rPr>
+          <w:iCs/>
+          <w:i/>
+        </w:rPr>
+        <w:t xml:space="preserve">Fisheries Oceanography</w:t>
+      </w:r>
+      <w:r>
+        <w:t xml:space="preserve">,</w:t>
+      </w:r>
+      <w:r>
+        <w:t xml:space="preserve"> </w:t>
+      </w:r>
+      <w:r>
+        <w:rPr>
+          <w:iCs/>
+          <w:i/>
+        </w:rPr>
+        <w:t xml:space="preserve">30</w:t>
+      </w:r>
+      <w:r>
+        <w:t xml:space="preserve">(2), 142–158.</w:t>
+      </w:r>
+      <w:r>
+        <w:t xml:space="preserve"> </w:t>
+      </w:r>
+      <w:hyperlink r:id="rId51">
+        <w:r>
+          <w:rPr>
+            <w:rStyle w:val="Hyperlink"/>
+          </w:rPr>
+          <w:t xml:space="preserve">https://doi.org/10.1111/fog.12508</w:t>
+        </w:r>
+      </w:hyperlink>
+    </w:p>
+    <w:bookmarkEnd w:id="52"/>
+    <w:bookmarkStart w:id="54" w:name="ref-Stabeno2019"/>
+    <w:p>
+      <w:pPr>
+        <w:pStyle w:val="Bibliography"/>
+      </w:pPr>
+      <w:r>
         <w:t xml:space="preserve">Stabeno, P. J., &amp; Bell, S. W. (2019).</w:t>
       </w:r>
       <w:r>
@@ -1019,8 +1385,8 @@
       </w:r>
       <w:r>
         <w:rPr>
-          <w:i/>
-          <w:iCs/>
+          <w:iCs/>
+          <w:i/>
         </w:rPr>
         <w:t xml:space="preserve">Geophysical Research Letters</w:t>
       </w:r>
@@ -1032,8 +1398,8 @@
       </w:r>
       <w:r>
         <w:rPr>
-          <w:i/>
-          <w:iCs/>
+          <w:iCs/>
+          <w:i/>
         </w:rPr>
         <w:t xml:space="preserve">46</w:t>
       </w:r>
@@ -1043,7 +1409,7 @@
       <w:r>
         <w:t xml:space="preserve"> </w:t>
       </w:r>
-      <w:hyperlink r:id="rId49">
+      <w:hyperlink r:id="rId53">
         <w:r>
           <w:rPr>
             <w:rStyle w:val="Hyperlink"/>
@@ -1052,8 +1418,8 @@
         </w:r>
       </w:hyperlink>
     </w:p>
-    <w:bookmarkEnd w:id="50"/>
-    <w:bookmarkStart w:id="52" w:name="ref-Wuenschel2019"/>
+    <w:bookmarkEnd w:id="54"/>
+    <w:bookmarkStart w:id="56" w:name="ref-Wuenschel2019"/>
     <w:p>
       <w:pPr>
         <w:pStyle w:val="Bibliography"/>
@@ -1075,8 +1441,8 @@
       </w:r>
       <w:r>
         <w:rPr>
-          <w:i/>
-          <w:iCs/>
+          <w:iCs/>
+          <w:i/>
         </w:rPr>
         <w:t xml:space="preserve">Canadian Journal of Fisheries and Aquatic Sciences</w:t>
       </w:r>
@@ -1088,8 +1454,8 @@
       </w:r>
       <w:r>
         <w:rPr>
-          <w:i/>
-          <w:iCs/>
+          <w:iCs/>
+          <w:i/>
         </w:rPr>
         <w:t xml:space="preserve">76</w:t>
       </w:r>
@@ -1099,7 +1465,7 @@
       <w:r>
         <w:t xml:space="preserve"> </w:t>
       </w:r>
-      <w:hyperlink r:id="rId51">
+      <w:hyperlink r:id="rId55">
         <w:r>
           <w:rPr>
             <w:rStyle w:val="Hyperlink"/>
@@ -1108,9 +1474,9 @@
         </w:r>
       </w:hyperlink>
     </w:p>
-    <w:bookmarkEnd w:id="52"/>
-    <w:bookmarkEnd w:id="53"/>
-    <w:bookmarkEnd w:id="54"/>
+    <w:bookmarkEnd w:id="56"/>
+    <w:bookmarkEnd w:id="57"/>
+    <w:bookmarkEnd w:id="58"/>
     <w:sectPr/>
   </w:body>
 </w:document>
@@ -1142,14 +1508,14 @@
 <file path=word/numbering.xml><?xml version="1.0" encoding="utf-8"?>
 <w:numbering xmlns:w="http://schemas.openxmlformats.org/wordprocessingml/2006/main">
   <w:abstractNum w:abstractNumId="990">
-    <w:nsid w:val="0000A990"/>
+    <w:nsid w:val="A990"/>
     <w:multiLevelType w:val="multilevel"/>
     <w:lvl w:ilvl="0">
       <w:numFmt w:val="bullet"/>
       <w:lvlText w:val=" "/>
       <w:lvlJc w:val="left"/>
       <w:pPr>
-        <w:ind w:left="720" w:hanging="360"/>
+        <w:ind w:left="720" w:hanging="480"/>
       </w:pPr>
     </w:lvl>
     <w:lvl w:ilvl="1">
@@ -1157,7 +1523,7 @@
       <w:lvlText w:val=" "/>
       <w:lvlJc w:val="left"/>
       <w:pPr>
-        <w:ind w:left="1440" w:hanging="360"/>
+        <w:ind w:left="1440" w:hanging="480"/>
       </w:pPr>
     </w:lvl>
     <w:lvl w:ilvl="2">
@@ -1165,7 +1531,7 @@
       <w:lvlText w:val=" "/>
       <w:lvlJc w:val="left"/>
       <w:pPr>
-        <w:ind w:left="2160" w:hanging="360"/>
+        <w:ind w:left="2160" w:hanging="480"/>
       </w:pPr>
     </w:lvl>
     <w:lvl w:ilvl="3">
@@ -1173,7 +1539,7 @@
       <w:lvlText w:val=" "/>
       <w:lvlJc w:val="left"/>
       <w:pPr>
-        <w:ind w:left="2880" w:hanging="360"/>
+        <w:ind w:left="2880" w:hanging="480"/>
       </w:pPr>
     </w:lvl>
     <w:lvl w:ilvl="4">
@@ -1181,7 +1547,7 @@
       <w:lvlText w:val=" "/>
       <w:lvlJc w:val="left"/>
       <w:pPr>
-        <w:ind w:left="3600" w:hanging="360"/>
+        <w:ind w:left="3600" w:hanging="480"/>
       </w:pPr>
     </w:lvl>
     <w:lvl w:ilvl="5">
@@ -1189,7 +1555,7 @@
       <w:lvlText w:val=" "/>
       <w:lvlJc w:val="left"/>
       <w:pPr>
-        <w:ind w:left="4320" w:hanging="360"/>
+        <w:ind w:left="4320" w:hanging="480"/>
       </w:pPr>
     </w:lvl>
     <w:lvl w:ilvl="6">
@@ -1197,7 +1563,7 @@
       <w:lvlText w:val=" "/>
       <w:lvlJc w:val="left"/>
       <w:pPr>
-        <w:ind w:left="5040" w:hanging="360"/>
+        <w:ind w:left="5040" w:hanging="480"/>
       </w:pPr>
     </w:lvl>
     <w:lvl w:ilvl="7">
@@ -1205,7 +1571,7 @@
       <w:lvlText w:val=" "/>
       <w:lvlJc w:val="left"/>
       <w:pPr>
-        <w:ind w:left="5760" w:hanging="360"/>
+        <w:ind w:left="5760" w:hanging="480"/>
       </w:pPr>
     </w:lvl>
     <w:lvl w:ilvl="8">
@@ -1213,7 +1579,7 @@
       <w:lvlText w:val=" "/>
       <w:lvlJc w:val="left"/>
       <w:pPr>
-        <w:ind w:left="6480" w:hanging="360"/>
+        <w:ind w:left="6480" w:hanging="480"/>
       </w:pPr>
     </w:lvl>
   </w:abstractNum>
@@ -1249,10 +1615,10 @@
     <w:name w:val="Body Text"/>
     <w:basedOn w:val="Normal"/>
     <w:link w:val="BodyTextChar"/>
-    <w:qFormat/>
     <w:pPr>
       <w:spacing w:after="180" w:before="180"/>
     </w:pPr>
+    <w:qFormat/>
   </w:style>
   <w:style w:customStyle="1" w:styleId="FirstParagraph" w:type="paragraph">
     <w:name w:val="First Paragraph"/>
@@ -1272,69 +1638,36 @@
     <w:name w:val="Title"/>
     <w:basedOn w:val="Normal"/>
     <w:next w:val="BodyText"/>
-    <w:link w:val="TitleChar"/>
-    <w:uiPriority w:val="10"/>
     <w:qFormat/>
-    <w:rsid w:val="00A10FD9"/>
     <w:pPr>
-      <w:spacing w:after="80" w:line="240" w:lineRule="auto"/>
-      <w:contextualSpacing/>
+      <w:keepNext/>
+      <w:keepLines/>
+      <w:spacing w:after="240" w:before="480"/>
       <w:jc w:val="center"/>
     </w:pPr>
     <w:rPr>
       <w:rFonts w:asciiTheme="majorHAnsi" w:cstheme="majorBidi" w:eastAsiaTheme="majorEastAsia" w:hAnsiTheme="majorHAnsi"/>
-      <w:spacing w:val="-10"/>
-      <w:kern w:val="28"/>
-      <w:sz w:val="56"/>
-      <w:szCs w:val="56"/>
-    </w:rPr>
-  </w:style>
-  <w:style w:customStyle="1" w:styleId="TitleChar" w:type="character">
-    <w:name w:val="Title Char"/>
-    <w:basedOn w:val="DefaultParagraphFont"/>
-    <w:link w:val="Title"/>
-    <w:uiPriority w:val="10"/>
-    <w:rsid w:val="00A10FD9"/>
-    <w:rPr>
-      <w:rFonts w:asciiTheme="majorHAnsi" w:cstheme="majorBidi" w:eastAsiaTheme="majorEastAsia" w:hAnsiTheme="majorHAnsi"/>
-      <w:spacing w:val="-10"/>
-      <w:kern w:val="28"/>
-      <w:sz w:val="56"/>
-      <w:szCs w:val="56"/>
+      <w:b/>
+      <w:bCs/>
+      <w:color w:themeColor="accent1" w:themeShade="B5" w:val="345A8A"/>
+      <w:sz w:val="36"/>
+      <w:szCs w:val="36"/>
     </w:rPr>
   </w:style>
   <w:style w:styleId="Subtitle" w:type="paragraph">
     <w:name w:val="Subtitle"/>
     <w:basedOn w:val="Title"/>
     <w:next w:val="BodyText"/>
-    <w:link w:val="SubtitleChar"/>
-    <w:uiPriority w:val="11"/>
     <w:qFormat/>
-    <w:rsid w:val="00A10FD9"/>
     <w:pPr>
-      <w:numPr>
-        <w:ilvl w:val="1"/>
-      </w:numPr>
+      <w:keepNext/>
+      <w:keepLines/>
+      <w:spacing w:after="240" w:before="240"/>
+      <w:jc w:val="center"/>
     </w:pPr>
     <w:rPr>
-      <w:rFonts w:cstheme="majorBidi" w:eastAsiaTheme="majorEastAsia"/>
-      <w:spacing w:val="15"/>
-      <w:sz w:val="28"/>
-      <w:szCs w:val="28"/>
-    </w:rPr>
-  </w:style>
-  <w:style w:customStyle="1" w:styleId="SubtitleChar" w:type="character">
-    <w:name w:val="Subtitle Char"/>
-    <w:basedOn w:val="DefaultParagraphFont"/>
-    <w:link w:val="Subtitle"/>
-    <w:uiPriority w:val="11"/>
-    <w:rsid w:val="00A10FD9"/>
-    <w:rPr>
-      <w:rFonts w:cstheme="majorBidi" w:eastAsiaTheme="majorEastAsia"/>
-      <w:color w:themeColor="text1" w:themeTint="A6" w:val="595959"/>
-      <w:spacing w:val="15"/>
-      <w:sz w:val="28"/>
-      <w:szCs w:val="28"/>
+      <w:sz w:val="30"/>
+      <w:szCs w:val="30"/>
     </w:rPr>
   </w:style>
   <w:style w:customStyle="1" w:styleId="Author" w:type="paragraph">
@@ -1365,13 +1698,15 @@
     <w:pPr>
       <w:keepNext/>
       <w:keepLines/>
+      <w:jc w:val="center"/>
       <w:spacing w:after="0" w:before="300"/>
-      <w:jc w:val="center"/>
     </w:pPr>
     <w:rPr>
-      <w:b/>
       <w:sz w:val="20"/>
       <w:szCs w:val="20"/>
+      <w:b/>
+      <w:color w:val="345A8A"/>
+      &gt;
     </w:rPr>
   </w:style>
   <w:style w:customStyle="1" w:styleId="Abstract" w:type="paragraph">
@@ -1398,321 +1733,191 @@
     <w:rPr/>
   </w:style>
   <w:style w:styleId="Heading1" w:type="paragraph">
-    <w:name w:val="heading 1"/>
+    <w:name w:val="Heading 1"/>
     <w:basedOn w:val="Normal"/>
     <w:next w:val="BodyText"/>
-    <w:link w:val="Heading1Char"/>
     <w:uiPriority w:val="9"/>
     <w:qFormat/>
-    <w:rsid w:val="00A10FD9"/>
     <w:pPr>
       <w:keepNext/>
       <w:keepLines/>
-      <w:spacing w:after="80" w:before="360"/>
+      <w:spacing w:after="0" w:before="480"/>
       <w:outlineLvl w:val="0"/>
     </w:pPr>
     <w:rPr>
       <w:rFonts w:asciiTheme="majorHAnsi" w:cstheme="majorBidi" w:eastAsiaTheme="majorEastAsia" w:hAnsiTheme="majorHAnsi"/>
-      <w:color w:themeColor="accent1" w:themeShade="BF" w:val="0F4761"/>
-      <w:sz w:val="40"/>
-      <w:szCs w:val="40"/>
+      <w:b/>
+      <w:bCs/>
+      <w:color w:themeColor="accent1" w:val="4F81BD"/>
+      <w:sz w:val="32"/>
+      <w:szCs w:val="32"/>
     </w:rPr>
   </w:style>
   <w:style w:styleId="Heading2" w:type="paragraph">
-    <w:name w:val="heading 2"/>
+    <w:name w:val="Heading 2"/>
     <w:basedOn w:val="Normal"/>
     <w:next w:val="BodyText"/>
-    <w:link w:val="Heading2Char"/>
     <w:uiPriority w:val="9"/>
-    <w:semiHidden/>
     <w:unhideWhenUsed/>
     <w:qFormat/>
-    <w:rsid w:val="00A10FD9"/>
     <w:pPr>
       <w:keepNext/>
       <w:keepLines/>
-      <w:spacing w:after="80" w:before="160"/>
+      <w:spacing w:after="0" w:before="200"/>
       <w:outlineLvl w:val="1"/>
     </w:pPr>
     <w:rPr>
       <w:rFonts w:asciiTheme="majorHAnsi" w:cstheme="majorBidi" w:eastAsiaTheme="majorEastAsia" w:hAnsiTheme="majorHAnsi"/>
-      <w:color w:themeColor="accent1" w:themeShade="BF" w:val="0F4761"/>
-      <w:sz w:val="32"/>
-      <w:szCs w:val="32"/>
+      <w:b/>
+      <w:bCs/>
+      <w:color w:themeColor="accent1" w:val="4F81BD"/>
+      <w:sz w:val="28"/>
+      <w:szCs w:val="28"/>
     </w:rPr>
   </w:style>
   <w:style w:styleId="Heading3" w:type="paragraph">
-    <w:name w:val="heading 3"/>
+    <w:name w:val="Heading 3"/>
     <w:basedOn w:val="Normal"/>
     <w:next w:val="BodyText"/>
-    <w:link w:val="Heading3Char"/>
     <w:uiPriority w:val="9"/>
-    <w:semiHidden/>
     <w:unhideWhenUsed/>
     <w:qFormat/>
-    <w:rsid w:val="00A10FD9"/>
     <w:pPr>
       <w:keepNext/>
       <w:keepLines/>
-      <w:spacing w:after="80" w:before="160"/>
+      <w:spacing w:after="0" w:before="200"/>
       <w:outlineLvl w:val="2"/>
     </w:pPr>
     <w:rPr>
-      <w:rFonts w:cstheme="majorBidi" w:eastAsiaTheme="majorEastAsia"/>
-      <w:color w:themeColor="accent1" w:themeShade="BF" w:val="0F4761"/>
-      <w:sz w:val="28"/>
-      <w:szCs w:val="28"/>
+      <w:rFonts w:asciiTheme="majorHAnsi" w:cstheme="majorBidi" w:eastAsiaTheme="majorEastAsia" w:hAnsiTheme="majorHAnsi"/>
+      <w:b/>
+      <w:bCs/>
+      <w:color w:themeColor="accent1" w:val="4F81BD"/>
+      <w:sz w:val="24"/>
+      <w:szCs w:val="24"/>
     </w:rPr>
   </w:style>
   <w:style w:styleId="Heading4" w:type="paragraph">
-    <w:name w:val="heading 4"/>
+    <w:name w:val="Heading 4"/>
     <w:basedOn w:val="Normal"/>
     <w:next w:val="BodyText"/>
-    <w:link w:val="Heading4Char"/>
     <w:uiPriority w:val="9"/>
-    <w:semiHidden/>
     <w:unhideWhenUsed/>
     <w:qFormat/>
-    <w:rsid w:val="00A10FD9"/>
     <w:pPr>
       <w:keepNext/>
       <w:keepLines/>
-      <w:spacing w:after="40" w:before="80"/>
+      <w:spacing w:after="0" w:before="200"/>
       <w:outlineLvl w:val="3"/>
     </w:pPr>
     <w:rPr>
-      <w:rFonts w:cstheme="majorBidi" w:eastAsiaTheme="majorEastAsia"/>
+      <w:rFonts w:asciiTheme="majorHAnsi" w:cstheme="majorBidi" w:eastAsiaTheme="majorEastAsia" w:hAnsiTheme="majorHAnsi"/>
       <w:i/>
-      <w:iCs/>
-      <w:color w:themeColor="accent1" w:themeShade="BF" w:val="0F4761"/>
+      <w:bCs/>
+      <w:color w:themeColor="accent1" w:val="4F81BD"/>
+      <w:sz w:val="24"/>
+      <w:szCs w:val="24"/>
     </w:rPr>
   </w:style>
   <w:style w:styleId="Heading5" w:type="paragraph">
-    <w:name w:val="heading 5"/>
+    <w:name w:val="Heading 5"/>
     <w:basedOn w:val="Normal"/>
     <w:next w:val="BodyText"/>
-    <w:link w:val="Heading5Char"/>
     <w:uiPriority w:val="9"/>
-    <w:semiHidden/>
     <w:unhideWhenUsed/>
     <w:qFormat/>
-    <w:rsid w:val="00A10FD9"/>
     <w:pPr>
       <w:keepNext/>
       <w:keepLines/>
-      <w:spacing w:after="40" w:before="80"/>
+      <w:spacing w:after="0" w:before="200"/>
       <w:outlineLvl w:val="4"/>
     </w:pPr>
     <w:rPr>
-      <w:rFonts w:cstheme="majorBidi" w:eastAsiaTheme="majorEastAsia"/>
-      <w:color w:themeColor="accent1" w:themeShade="BF" w:val="0F4761"/>
+      <w:rFonts w:asciiTheme="majorHAnsi" w:cstheme="majorBidi" w:eastAsiaTheme="majorEastAsia" w:hAnsiTheme="majorHAnsi"/>
+      <w:iCs/>
+      <w:color w:themeColor="accent1" w:val="4F81BD"/>
+      <w:sz w:val="24"/>
+      <w:szCs w:val="24"/>
     </w:rPr>
   </w:style>
   <w:style w:styleId="Heading6" w:type="paragraph">
-    <w:name w:val="heading 6"/>
+    <w:name w:val="Heading 6"/>
     <w:basedOn w:val="Normal"/>
     <w:next w:val="BodyText"/>
-    <w:link w:val="Heading6Char"/>
     <w:uiPriority w:val="9"/>
-    <w:semiHidden/>
     <w:unhideWhenUsed/>
     <w:qFormat/>
-    <w:rsid w:val="00A10FD9"/>
     <w:pPr>
       <w:keepNext/>
       <w:keepLines/>
-      <w:spacing w:after="0" w:before="40"/>
+      <w:spacing w:after="0" w:before="200"/>
       <w:outlineLvl w:val="5"/>
     </w:pPr>
     <w:rPr>
-      <w:rFonts w:cstheme="majorBidi" w:eastAsiaTheme="majorEastAsia"/>
-      <w:i/>
-      <w:iCs/>
-      <w:color w:themeColor="text1" w:themeTint="A6" w:val="595959"/>
+      <w:rFonts w:asciiTheme="majorHAnsi" w:cstheme="majorBidi" w:eastAsiaTheme="majorEastAsia" w:hAnsiTheme="majorHAnsi"/>
+      <w:color w:themeColor="accent1" w:val="4F81BD"/>
+      <w:sz w:val="24"/>
+      <w:szCs w:val="24"/>
     </w:rPr>
   </w:style>
   <w:style w:styleId="Heading7" w:type="paragraph">
-    <w:name w:val="heading 7"/>
+    <w:name w:val="Heading 7"/>
     <w:basedOn w:val="Normal"/>
     <w:next w:val="BodyText"/>
-    <w:link w:val="Heading7Char"/>
     <w:uiPriority w:val="9"/>
-    <w:semiHidden/>
     <w:unhideWhenUsed/>
     <w:qFormat/>
-    <w:rsid w:val="00A10FD9"/>
     <w:pPr>
       <w:keepNext/>
       <w:keepLines/>
-      <w:spacing w:after="0" w:before="40"/>
+      <w:spacing w:after="0" w:before="200"/>
       <w:outlineLvl w:val="6"/>
     </w:pPr>
     <w:rPr>
-      <w:rFonts w:cstheme="majorBidi" w:eastAsiaTheme="majorEastAsia"/>
-      <w:color w:themeColor="text1" w:themeTint="A6" w:val="595959"/>
+      <w:rFonts w:asciiTheme="majorHAnsi" w:cstheme="majorBidi" w:eastAsiaTheme="majorEastAsia" w:hAnsiTheme="majorHAnsi"/>
+      <w:color w:themeColor="accent1" w:val="4F81BD"/>
+      <w:sz w:val="24"/>
+      <w:szCs w:val="24"/>
     </w:rPr>
   </w:style>
   <w:style w:styleId="Heading8" w:type="paragraph">
-    <w:name w:val="heading 8"/>
+    <w:name w:val="Heading 8"/>
     <w:basedOn w:val="Normal"/>
     <w:next w:val="BodyText"/>
-    <w:link w:val="Heading8Char"/>
     <w:uiPriority w:val="9"/>
-    <w:semiHidden/>
     <w:unhideWhenUsed/>
     <w:qFormat/>
-    <w:rsid w:val="00A10FD9"/>
     <w:pPr>
       <w:keepNext/>
       <w:keepLines/>
-      <w:spacing w:after="0"/>
+      <w:spacing w:after="0" w:before="200"/>
       <w:outlineLvl w:val="7"/>
     </w:pPr>
     <w:rPr>
-      <w:rFonts w:cstheme="majorBidi" w:eastAsiaTheme="majorEastAsia"/>
-      <w:i/>
-      <w:iCs/>
-      <w:color w:themeColor="text1" w:themeTint="D8" w:val="272727"/>
+      <w:rFonts w:asciiTheme="majorHAnsi" w:cstheme="majorBidi" w:eastAsiaTheme="majorEastAsia" w:hAnsiTheme="majorHAnsi"/>
+      <w:color w:themeColor="accent1" w:val="4F81BD"/>
+      <w:sz w:val="24"/>
+      <w:szCs w:val="24"/>
     </w:rPr>
   </w:style>
   <w:style w:styleId="Heading9" w:type="paragraph">
-    <w:name w:val="heading 9"/>
+    <w:name w:val="Heading 9"/>
     <w:basedOn w:val="Normal"/>
     <w:next w:val="BodyText"/>
-    <w:link w:val="Heading9Char"/>
     <w:uiPriority w:val="9"/>
-    <w:semiHidden/>
     <w:unhideWhenUsed/>
     <w:qFormat/>
-    <w:rsid w:val="00A10FD9"/>
     <w:pPr>
       <w:keepNext/>
       <w:keepLines/>
-      <w:spacing w:after="0"/>
+      <w:spacing w:after="0" w:before="200"/>
       <w:outlineLvl w:val="8"/>
     </w:pPr>
     <w:rPr>
-      <w:rFonts w:cstheme="majorBidi" w:eastAsiaTheme="majorEastAsia"/>
-      <w:color w:themeColor="text1" w:themeTint="D8" w:val="272727"/>
-    </w:rPr>
-  </w:style>
-  <w:style w:customStyle="1" w:styleId="Heading1Char" w:type="character">
-    <w:name w:val="Heading 1 Char"/>
-    <w:basedOn w:val="DefaultParagraphFont"/>
-    <w:link w:val="Heading1"/>
-    <w:uiPriority w:val="9"/>
-    <w:rsid w:val="00A10FD9"/>
-    <w:rPr>
       <w:rFonts w:asciiTheme="majorHAnsi" w:cstheme="majorBidi" w:eastAsiaTheme="majorEastAsia" w:hAnsiTheme="majorHAnsi"/>
-      <w:color w:themeColor="accent1" w:themeShade="BF" w:val="0F4761"/>
-      <w:sz w:val="40"/>
-      <w:szCs w:val="40"/>
-    </w:rPr>
-  </w:style>
-  <w:style w:customStyle="1" w:styleId="Heading2Char" w:type="character">
-    <w:name w:val="Heading 2 Char"/>
-    <w:basedOn w:val="DefaultParagraphFont"/>
-    <w:link w:val="Heading2"/>
-    <w:uiPriority w:val="9"/>
-    <w:semiHidden/>
-    <w:rsid w:val="00A10FD9"/>
-    <w:rPr>
-      <w:rFonts w:asciiTheme="majorHAnsi" w:cstheme="majorBidi" w:eastAsiaTheme="majorEastAsia" w:hAnsiTheme="majorHAnsi"/>
-      <w:color w:themeColor="accent1" w:themeShade="BF" w:val="0F4761"/>
-      <w:sz w:val="32"/>
-      <w:szCs w:val="32"/>
-    </w:rPr>
-  </w:style>
-  <w:style w:customStyle="1" w:styleId="Heading3Char" w:type="character">
-    <w:name w:val="Heading 3 Char"/>
-    <w:basedOn w:val="DefaultParagraphFont"/>
-    <w:link w:val="Heading3"/>
-    <w:uiPriority w:val="9"/>
-    <w:semiHidden/>
-    <w:rsid w:val="00A10FD9"/>
-    <w:rPr>
-      <w:rFonts w:cstheme="majorBidi" w:eastAsiaTheme="majorEastAsia"/>
-      <w:color w:themeColor="accent1" w:themeShade="BF" w:val="0F4761"/>
-      <w:sz w:val="28"/>
-      <w:szCs w:val="28"/>
-    </w:rPr>
-  </w:style>
-  <w:style w:customStyle="1" w:styleId="Heading4Char" w:type="character">
-    <w:name w:val="Heading 4 Char"/>
-    <w:basedOn w:val="DefaultParagraphFont"/>
-    <w:link w:val="Heading4"/>
-    <w:uiPriority w:val="9"/>
-    <w:semiHidden/>
-    <w:rsid w:val="00A10FD9"/>
-    <w:rPr>
-      <w:rFonts w:cstheme="majorBidi" w:eastAsiaTheme="majorEastAsia"/>
-      <w:i/>
-      <w:iCs/>
-      <w:color w:themeColor="accent1" w:themeShade="BF" w:val="0F4761"/>
-    </w:rPr>
-  </w:style>
-  <w:style w:customStyle="1" w:styleId="Heading5Char" w:type="character">
-    <w:name w:val="Heading 5 Char"/>
-    <w:basedOn w:val="DefaultParagraphFont"/>
-    <w:link w:val="Heading5"/>
-    <w:uiPriority w:val="9"/>
-    <w:semiHidden/>
-    <w:rsid w:val="00A10FD9"/>
-    <w:rPr>
-      <w:rFonts w:cstheme="majorBidi" w:eastAsiaTheme="majorEastAsia"/>
-      <w:color w:themeColor="accent1" w:themeShade="BF" w:val="0F4761"/>
-    </w:rPr>
-  </w:style>
-  <w:style w:customStyle="1" w:styleId="Heading6Char" w:type="character">
-    <w:name w:val="Heading 6 Char"/>
-    <w:basedOn w:val="DefaultParagraphFont"/>
-    <w:link w:val="Heading6"/>
-    <w:uiPriority w:val="9"/>
-    <w:semiHidden/>
-    <w:rsid w:val="00A10FD9"/>
-    <w:rPr>
-      <w:rFonts w:cstheme="majorBidi" w:eastAsiaTheme="majorEastAsia"/>
-      <w:i/>
-      <w:iCs/>
-      <w:color w:themeColor="text1" w:themeTint="A6" w:val="595959"/>
-    </w:rPr>
-  </w:style>
-  <w:style w:customStyle="1" w:styleId="Heading7Char" w:type="character">
-    <w:name w:val="Heading 7 Char"/>
-    <w:basedOn w:val="DefaultParagraphFont"/>
-    <w:link w:val="Heading7"/>
-    <w:uiPriority w:val="9"/>
-    <w:semiHidden/>
-    <w:rsid w:val="00A10FD9"/>
-    <w:rPr>
-      <w:rFonts w:cstheme="majorBidi" w:eastAsiaTheme="majorEastAsia"/>
-      <w:color w:themeColor="text1" w:themeTint="A6" w:val="595959"/>
-    </w:rPr>
-  </w:style>
-  <w:style w:customStyle="1" w:styleId="Heading8Char" w:type="character">
-    <w:name w:val="Heading 8 Char"/>
-    <w:basedOn w:val="DefaultParagraphFont"/>
-    <w:link w:val="Heading8"/>
-    <w:uiPriority w:val="9"/>
-    <w:semiHidden/>
-    <w:rsid w:val="00A10FD9"/>
-    <w:rPr>
-      <w:rFonts w:cstheme="majorBidi" w:eastAsiaTheme="majorEastAsia"/>
-      <w:i/>
-      <w:iCs/>
-      <w:color w:themeColor="text1" w:themeTint="D8" w:val="272727"/>
-    </w:rPr>
-  </w:style>
-  <w:style w:customStyle="1" w:styleId="Heading9Char" w:type="character">
-    <w:name w:val="Heading 9 Char"/>
-    <w:basedOn w:val="DefaultParagraphFont"/>
-    <w:link w:val="Heading9"/>
-    <w:uiPriority w:val="9"/>
-    <w:semiHidden/>
-    <w:rsid w:val="00A10FD9"/>
-    <w:rPr>
-      <w:rFonts w:cstheme="majorBidi" w:eastAsiaTheme="majorEastAsia"/>
-      <w:color w:themeColor="text1" w:themeTint="D8" w:val="272727"/>
+      <w:color w:themeColor="accent1" w:val="4F81BD"/>
+      <w:sz w:val="24"/>
+      <w:szCs w:val="24"/>
     </w:rPr>
   </w:style>
   <w:style w:styleId="BlockText" w:type="paragraph">
@@ -1737,8 +1942,8 @@
   </w:style>
   <w:style w:styleId="FootnoteBlockText" w:type="paragraph">
     <w:name w:val="Footnote Block Text"/>
-    <w:basedOn w:val="FootnoteText"/>
-    <w:next w:val="FootnoteText"/>
+    <w:basedOn w:val="Footnote Text"/>
+    <w:next w:val="Footnote Text"/>
     <w:uiPriority w:val="9"/>
     <w:unhideWhenUsed/>
     <w:qFormat/>
@@ -1776,10 +1981,10 @@
         <w:jc w:val="left"/>
       </w:trPr>
       <w:tcPr>
+        <w:vAlign w:val="bottom"/>
         <w:tcBorders>
           <w:bottom w:val="single"/>
         </w:tcBorders>
-        <w:vAlign w:val="bottom"/>
       </w:tcPr>
     </w:tblStylePr>
   </w:style>
@@ -1895,9 +2100,9 @@
     <w:name w:val="KeywordTok"/>
     <w:basedOn w:val="VerbatimChar"/>
     <w:rPr>
+      <w:color w:val="204a87"/>
+      <w:shd w:val="clear" w:fill="f8f8f8"/>
       <w:b/>
-      <w:color w:val="204a87"/>
-      <w:shd w:val="clear" w:fill="f8f8f8"/>
     </w:rPr>
   </w:style>
   <w:style w:type="character" w:customStyle="1" w:styleId="DataTypeTok">
@@ -1952,9 +2157,9 @@
     <w:name w:val="SpecialCharTok"/>
     <w:basedOn w:val="VerbatimChar"/>
     <w:rPr>
+      <w:color w:val="ce5c00"/>
+      <w:shd w:val="clear" w:fill="f8f8f8"/>
       <w:b/>
-      <w:color w:val="ce5c00"/>
-      <w:shd w:val="clear" w:fill="f8f8f8"/>
     </w:rPr>
   </w:style>
   <w:style w:type="character" w:customStyle="1" w:styleId="StringTok">
@@ -1992,39 +2197,39 @@
     <w:name w:val="CommentTok"/>
     <w:basedOn w:val="VerbatimChar"/>
     <w:rPr>
+      <w:color w:val="8f5902"/>
+      <w:shd w:val="clear" w:fill="f8f8f8"/>
       <w:i/>
-      <w:color w:val="8f5902"/>
-      <w:shd w:val="clear" w:fill="f8f8f8"/>
     </w:rPr>
   </w:style>
   <w:style w:type="character" w:customStyle="1" w:styleId="DocumentationTok">
     <w:name w:val="DocumentationTok"/>
     <w:basedOn w:val="VerbatimChar"/>
     <w:rPr>
+      <w:color w:val="8f5902"/>
+      <w:shd w:val="clear" w:fill="f8f8f8"/>
       <w:b/>
       <w:i/>
-      <w:color w:val="8f5902"/>
-      <w:shd w:val="clear" w:fill="f8f8f8"/>
     </w:rPr>
   </w:style>
   <w:style w:type="character" w:customStyle="1" w:styleId="AnnotationTok">
     <w:name w:val="AnnotationTok"/>
     <w:basedOn w:val="VerbatimChar"/>
     <w:rPr>
+      <w:color w:val="8f5902"/>
+      <w:shd w:val="clear" w:fill="f8f8f8"/>
       <w:b/>
       <w:i/>
-      <w:color w:val="8f5902"/>
-      <w:shd w:val="clear" w:fill="f8f8f8"/>
     </w:rPr>
   </w:style>
   <w:style w:type="character" w:customStyle="1" w:styleId="CommentVarTok">
     <w:name w:val="CommentVarTok"/>
     <w:basedOn w:val="VerbatimChar"/>
     <w:rPr>
+      <w:color w:val="8f5902"/>
+      <w:shd w:val="clear" w:fill="f8f8f8"/>
       <w:b/>
       <w:i/>
-      <w:color w:val="8f5902"/>
-      <w:shd w:val="clear" w:fill="f8f8f8"/>
     </w:rPr>
   </w:style>
   <w:style w:type="character" w:customStyle="1" w:styleId="OtherTok">
@@ -2039,9 +2244,9 @@
     <w:name w:val="FunctionTok"/>
     <w:basedOn w:val="VerbatimChar"/>
     <w:rPr>
+      <w:color w:val="204a87"/>
+      <w:shd w:val="clear" w:fill="f8f8f8"/>
       <w:b/>
-      <w:color w:val="204a87"/>
-      <w:shd w:val="clear" w:fill="f8f8f8"/>
     </w:rPr>
   </w:style>
   <w:style w:type="character" w:customStyle="1" w:styleId="VariableTok">
@@ -2056,18 +2261,18 @@
     <w:name w:val="ControlFlowTok"/>
     <w:basedOn w:val="VerbatimChar"/>
     <w:rPr>
+      <w:color w:val="204a87"/>
+      <w:shd w:val="clear" w:fill="f8f8f8"/>
       <w:b/>
-      <w:color w:val="204a87"/>
-      <w:shd w:val="clear" w:fill="f8f8f8"/>
     </w:rPr>
   </w:style>
   <w:style w:type="character" w:customStyle="1" w:styleId="OperatorTok">
     <w:name w:val="OperatorTok"/>
     <w:basedOn w:val="VerbatimChar"/>
     <w:rPr>
+      <w:color w:val="ce5c00"/>
+      <w:shd w:val="clear" w:fill="f8f8f8"/>
       <w:b/>
-      <w:color w:val="ce5c00"/>
-      <w:shd w:val="clear" w:fill="f8f8f8"/>
     </w:rPr>
   </w:style>
   <w:style w:type="character" w:customStyle="1" w:styleId="BuiltInTok">
@@ -2088,9 +2293,9 @@
     <w:name w:val="PreprocessorTok"/>
     <w:basedOn w:val="VerbatimChar"/>
     <w:rPr>
+      <w:color w:val="8f5902"/>
+      <w:shd w:val="clear" w:fill="f8f8f8"/>
       <w:i/>
-      <w:color w:val="8f5902"/>
-      <w:shd w:val="clear" w:fill="f8f8f8"/>
     </w:rPr>
   </w:style>
   <w:style w:type="character" w:customStyle="1" w:styleId="AttributeTok">
@@ -2112,20 +2317,20 @@
     <w:name w:val="InformationTok"/>
     <w:basedOn w:val="VerbatimChar"/>
     <w:rPr>
+      <w:color w:val="8f5902"/>
+      <w:shd w:val="clear" w:fill="f8f8f8"/>
       <w:b/>
       <w:i/>
-      <w:color w:val="8f5902"/>
-      <w:shd w:val="clear" w:fill="f8f8f8"/>
     </w:rPr>
   </w:style>
   <w:style w:type="character" w:customStyle="1" w:styleId="WarningTok">
     <w:name w:val="WarningTok"/>
     <w:basedOn w:val="VerbatimChar"/>
     <w:rPr>
+      <w:color w:val="8f5902"/>
+      <w:shd w:val="clear" w:fill="f8f8f8"/>
       <w:b/>
       <w:i/>
-      <w:color w:val="8f5902"/>
-      <w:shd w:val="clear" w:fill="f8f8f8"/>
     </w:rPr>
   </w:style>
   <w:style w:type="character" w:customStyle="1" w:styleId="AlertTok">
@@ -2140,9 +2345,9 @@
     <w:name w:val="ErrorTok"/>
     <w:basedOn w:val="VerbatimChar"/>
     <w:rPr>
+      <w:color w:val="a40000"/>
+      <w:shd w:val="clear" w:fill="f8f8f8"/>
       <w:b/>
-      <w:color w:val="a40000"/>
-      <w:shd w:val="clear" w:fill="f8f8f8"/>
     </w:rPr>
   </w:style>
   <w:style w:type="character" w:customStyle="1" w:styleId="NormalTok">
@@ -2166,44 +2371,44 @@
         <a:sysClr val="window" lastClr="FFFFFF"/>
       </a:lt1>
       <a:dk2>
-        <a:srgbClr val="0E2841"/>
+        <a:srgbClr val="1F497D"/>
       </a:dk2>
       <a:lt2>
-        <a:srgbClr val="E8E8E8"/>
+        <a:srgbClr val="EEECE1"/>
       </a:lt2>
       <a:accent1>
-        <a:srgbClr val="156082"/>
+        <a:srgbClr val="4F81BD"/>
       </a:accent1>
       <a:accent2>
-        <a:srgbClr val="E97132"/>
+        <a:srgbClr val="C0504D"/>
       </a:accent2>
       <a:accent3>
-        <a:srgbClr val="196B24"/>
+        <a:srgbClr val="9BBB59"/>
       </a:accent3>
       <a:accent4>
-        <a:srgbClr val="0F9ED5"/>
+        <a:srgbClr val="8064A2"/>
       </a:accent4>
       <a:accent5>
-        <a:srgbClr val="A02B93"/>
+        <a:srgbClr val="4BACC6"/>
       </a:accent5>
       <a:accent6>
-        <a:srgbClr val="4EA72E"/>
+        <a:srgbClr val="F79646"/>
       </a:accent6>
       <a:hlink>
-        <a:srgbClr val="467886"/>
+        <a:srgbClr val="0000FF"/>
       </a:hlink>
       <a:folHlink>
-        <a:srgbClr val="96607D"/>
+        <a:srgbClr val="800080"/>
       </a:folHlink>
     </a:clrScheme>
     <a:fontScheme name="Office">
       <a:majorFont>
-        <a:latin typeface="Aptos Display" panose="02110004020202020204"/>
+        <a:latin typeface="Calibri"/>
         <a:ea typeface=""/>
         <a:cs typeface=""/>
-        <a:font script="Jpan" typeface="游ゴシック Light"/>
+        <a:font script="Jpan" typeface="ＭＳ ゴシック"/>
         <a:font script="Hang" typeface="맑은 고딕"/>
-        <a:font script="Hans" typeface="等线 Light"/>
+        <a:font script="Hans" typeface="宋体"/>
         <a:font script="Hant" typeface="新細明體"/>
         <a:font script="Arab" typeface="Times New Roman"/>
         <a:font script="Hebr" typeface="Times New Roman"/>
@@ -2230,32 +2435,14 @@
         <a:font script="Mong" typeface="Mongolian Baiti"/>
         <a:font script="Viet" typeface="Times New Roman"/>
         <a:font script="Uigh" typeface="Microsoft Uighur"/>
-        <a:font script="Geor" typeface="Sylfaen"/>
-        <a:font script="Armn" typeface="Arial"/>
-        <a:font script="Bugi" typeface="Leelawadee UI"/>
-        <a:font script="Bopo" typeface="Microsoft JhengHei"/>
-        <a:font script="Java" typeface="Javanese Text"/>
-        <a:font script="Lisu" typeface="Segoe UI"/>
-        <a:font script="Mymr" typeface="Myanmar Text"/>
-        <a:font script="Nkoo" typeface="Ebrima"/>
-        <a:font script="Olck" typeface="Nirmala UI"/>
-        <a:font script="Osma" typeface="Ebrima"/>
-        <a:font script="Phag" typeface="Phagspa"/>
-        <a:font script="Syrn" typeface="Estrangelo Edessa"/>
-        <a:font script="Syrj" typeface="Estrangelo Edessa"/>
-        <a:font script="Syre" typeface="Estrangelo Edessa"/>
-        <a:font script="Sora" typeface="Nirmala UI"/>
-        <a:font script="Tale" typeface="Microsoft Tai Le"/>
-        <a:font script="Talu" typeface="Microsoft New Tai Lue"/>
-        <a:font script="Tfng" typeface="Ebrima"/>
       </a:majorFont>
       <a:minorFont>
-        <a:latin typeface="Aptos" panose="02110004020202020204"/>
+        <a:latin typeface="Cambria"/>
         <a:ea typeface=""/>
         <a:cs typeface=""/>
-        <a:font script="Jpan" typeface="游明朝"/>
+        <a:font script="Jpan" typeface="ＭＳ 明朝"/>
         <a:font script="Hang" typeface="맑은 고딕"/>
-        <a:font script="Hans" typeface="等线"/>
+        <a:font script="Hans" typeface="宋体"/>
         <a:font script="Hant" typeface="新細明體"/>
         <a:font script="Arab" typeface="Arial"/>
         <a:font script="Hebr" typeface="Arial"/>
@@ -2282,24 +2469,6 @@
         <a:font script="Mong" typeface="Mongolian Baiti"/>
         <a:font script="Viet" typeface="Arial"/>
         <a:font script="Uigh" typeface="Microsoft Uighur"/>
-        <a:font script="Geor" typeface="Sylfaen"/>
-        <a:font script="Armn" typeface="Arial"/>
-        <a:font script="Bugi" typeface="Leelawadee UI"/>
-        <a:font script="Bopo" typeface="Microsoft JhengHei"/>
-        <a:font script="Java" typeface="Javanese Text"/>
-        <a:font script="Lisu" typeface="Segoe UI"/>
-        <a:font script="Mymr" typeface="Myanmar Text"/>
-        <a:font script="Nkoo" typeface="Ebrima"/>
-        <a:font script="Olck" typeface="Nirmala UI"/>
-        <a:font script="Osma" typeface="Ebrima"/>
-        <a:font script="Phag" typeface="Phagspa"/>
-        <a:font script="Syrn" typeface="Estrangelo Edessa"/>
-        <a:font script="Syrj" typeface="Estrangelo Edessa"/>
-        <a:font script="Syre" typeface="Estrangelo Edessa"/>
-        <a:font script="Sora" typeface="Nirmala UI"/>
-        <a:font script="Tale" typeface="Microsoft Tai Le"/>
-        <a:font script="Talu" typeface="Microsoft New Tai Lue"/>
-        <a:font script="Tfng" typeface="Ebrima"/>
       </a:minorFont>
     </a:fontScheme>
     <a:fmtScheme name="Office">
@@ -2311,141 +2480,200 @@
           <a:gsLst>
             <a:gs pos="0">
               <a:schemeClr val="phClr">
-                <a:lumMod val="110000"/>
-                <a:satMod val="105000"/>
-                <a:tint val="67000"/>
+                <a:tint val="50000"/>
+                <a:satMod val="300000"/>
               </a:schemeClr>
             </a:gs>
-            <a:gs pos="50000">
+            <a:gs pos="35000">
               <a:schemeClr val="phClr">
-                <a:lumMod val="105000"/>
-                <a:satMod val="103000"/>
-                <a:tint val="73000"/>
+                <a:tint val="37000"/>
+                <a:satMod val="300000"/>
               </a:schemeClr>
             </a:gs>
             <a:gs pos="100000">
               <a:schemeClr val="phClr">
-                <a:lumMod val="105000"/>
-                <a:satMod val="109000"/>
-                <a:tint val="81000"/>
+                <a:tint val="15000"/>
+                <a:satMod val="350000"/>
               </a:schemeClr>
             </a:gs>
           </a:gsLst>
-          <a:lin ang="5400000" scaled="0"/>
+          <a:lin ang="16200000" scaled="1"/>
         </a:gradFill>
         <a:gradFill rotWithShape="1">
           <a:gsLst>
             <a:gs pos="0">
               <a:schemeClr val="phClr">
-                <a:satMod val="103000"/>
-                <a:lumMod val="102000"/>
-                <a:tint val="94000"/>
-              </a:schemeClr>
-            </a:gs>
-            <a:gs pos="50000">
-              <a:schemeClr val="phClr">
-                <a:satMod val="110000"/>
-                <a:lumMod val="100000"/>
+                <a:tint val="100000"/>
                 <a:shade val="100000"/>
+                <a:satMod val="130000"/>
               </a:schemeClr>
             </a:gs>
             <a:gs pos="100000">
               <a:schemeClr val="phClr">
-                <a:lumMod val="99000"/>
-                <a:satMod val="120000"/>
-                <a:shade val="78000"/>
+                <a:tint val="50000"/>
+                <a:shade val="100000"/>
+                <a:satMod val="350000"/>
               </a:schemeClr>
             </a:gs>
           </a:gsLst>
-          <a:lin ang="5400000" scaled="0"/>
+          <a:lin ang="16200000" scaled="0"/>
         </a:gradFill>
       </a:fillStyleLst>
       <a:lnStyleLst>
-        <a:ln w="6350" cap="flat" cmpd="sng" algn="ctr">
+        <a:ln w="9525" cap="flat" cmpd="sng" algn="ctr">
+          <a:solidFill>
+            <a:schemeClr val="phClr">
+              <a:shade val="95000"/>
+              <a:satMod val="105000"/>
+            </a:schemeClr>
+          </a:solidFill>
+          <a:prstDash val="solid"/>
+        </a:ln>
+        <a:ln w="25400" cap="flat" cmpd="sng" algn="ctr">
           <a:solidFill>
             <a:schemeClr val="phClr"/>
           </a:solidFill>
           <a:prstDash val="solid"/>
-          <a:miter lim="800000"/>
         </a:ln>
-        <a:ln w="12700" cap="flat" cmpd="sng" algn="ctr">
+        <a:ln w="38100" cap="flat" cmpd="sng" algn="ctr">
           <a:solidFill>
             <a:schemeClr val="phClr"/>
           </a:solidFill>
           <a:prstDash val="solid"/>
-          <a:miter lim="800000"/>
-        </a:ln>
-        <a:ln w="19050" cap="flat" cmpd="sng" algn="ctr">
-          <a:solidFill>
-            <a:schemeClr val="phClr"/>
-          </a:solidFill>
-          <a:prstDash val="solid"/>
-          <a:miter lim="800000"/>
         </a:ln>
       </a:lnStyleLst>
       <a:effectStyleLst>
         <a:effectStyle>
-          <a:effectLst/>
-        </a:effectStyle>
-        <a:effectStyle>
-          <a:effectLst/>
+          <a:effectLst>
+            <a:outerShdw blurRad="40000" dist="20000" dir="5400000" rotWithShape="0">
+              <a:srgbClr val="000000">
+                <a:alpha val="38000"/>
+              </a:srgbClr>
+            </a:outerShdw>
+          </a:effectLst>
         </a:effectStyle>
         <a:effectStyle>
           <a:effectLst>
-            <a:outerShdw blurRad="57150" dist="19050" dir="5400000" algn="ctr" rotWithShape="0">
+            <a:outerShdw blurRad="40000" dist="23000" dir="5400000" rotWithShape="0">
               <a:srgbClr val="000000">
-                <a:alpha val="63000"/>
+                <a:alpha val="35000"/>
               </a:srgbClr>
             </a:outerShdw>
           </a:effectLst>
+        </a:effectStyle>
+        <a:effectStyle>
+          <a:effectLst>
+            <a:outerShdw blurRad="40000" dist="23000" dir="5400000" rotWithShape="0">
+              <a:srgbClr val="000000">
+                <a:alpha val="35000"/>
+              </a:srgbClr>
+            </a:outerShdw>
+          </a:effectLst>
+          <a:scene3d>
+            <a:camera prst="orthographicFront">
+              <a:rot lat="0" lon="0" rev="0"/>
+            </a:camera>
+            <a:lightRig rig="threePt" dir="t">
+              <a:rot lat="0" lon="0" rev="1200000"/>
+            </a:lightRig>
+          </a:scene3d>
+          <a:sp3d>
+            <a:bevelT w="63500" h="25400"/>
+          </a:sp3d>
         </a:effectStyle>
       </a:effectStyleLst>
       <a:bgFillStyleLst>
         <a:solidFill>
           <a:schemeClr val="phClr"/>
         </a:solidFill>
-        <a:solidFill>
-          <a:schemeClr val="phClr">
-            <a:tint val="95000"/>
-            <a:satMod val="170000"/>
-          </a:schemeClr>
-        </a:solidFill>
         <a:gradFill rotWithShape="1">
           <a:gsLst>
             <a:gs pos="0">
               <a:schemeClr val="phClr">
-                <a:tint val="93000"/>
-                <a:satMod val="150000"/>
-                <a:shade val="98000"/>
-                <a:lumMod val="102000"/>
+                <a:tint val="40000"/>
+                <a:satMod val="350000"/>
               </a:schemeClr>
             </a:gs>
-            <a:gs pos="50000">
+            <a:gs pos="40000">
               <a:schemeClr val="phClr">
-                <a:tint val="98000"/>
-                <a:satMod val="130000"/>
-                <a:shade val="90000"/>
-                <a:lumMod val="103000"/>
+                <a:tint val="45000"/>
+                <a:shade val="99000"/>
+                <a:satMod val="350000"/>
               </a:schemeClr>
             </a:gs>
             <a:gs pos="100000">
               <a:schemeClr val="phClr">
-                <a:shade val="63000"/>
-                <a:satMod val="120000"/>
+                <a:shade val="20000"/>
+                <a:satMod val="255000"/>
               </a:schemeClr>
             </a:gs>
           </a:gsLst>
-          <a:lin ang="5400000" scaled="0"/>
+          <a:path path="circle">
+            <a:fillToRect l="50000" t="-80000" r="50000" b="180000"/>
+          </a:path>
+        </a:gradFill>
+        <a:gradFill rotWithShape="1">
+          <a:gsLst>
+            <a:gs pos="0">
+              <a:schemeClr val="phClr">
+                <a:tint val="80000"/>
+                <a:satMod val="300000"/>
+              </a:schemeClr>
+            </a:gs>
+            <a:gs pos="100000">
+              <a:schemeClr val="phClr">
+                <a:shade val="30000"/>
+                <a:satMod val="200000"/>
+              </a:schemeClr>
+            </a:gs>
+          </a:gsLst>
+          <a:path path="circle">
+            <a:fillToRect l="50000" t="50000" r="50000" b="50000"/>
+          </a:path>
         </a:gradFill>
       </a:bgFillStyleLst>
     </a:fmtScheme>
   </a:themeElements>
-  <a:objectDefaults/>
+  <a:objectDefaults>
+    <a:spDef>
+      <a:spPr/>
+      <a:bodyPr/>
+      <a:lstStyle/>
+      <a:style>
+        <a:lnRef idx="1">
+          <a:schemeClr val="accent1"/>
+        </a:lnRef>
+        <a:fillRef idx="3">
+          <a:schemeClr val="accent1"/>
+        </a:fillRef>
+        <a:effectRef idx="2">
+          <a:schemeClr val="accent1"/>
+        </a:effectRef>
+        <a:fontRef idx="minor">
+          <a:schemeClr val="lt1"/>
+        </a:fontRef>
+      </a:style>
+    </a:spDef>
+    <a:lnDef>
+      <a:spPr/>
+      <a:bodyPr/>
+      <a:lstStyle/>
+      <a:style>
+        <a:lnRef idx="2">
+          <a:schemeClr val="accent1"/>
+        </a:lnRef>
+        <a:fillRef idx="0">
+          <a:schemeClr val="accent1"/>
+        </a:fillRef>
+        <a:effectRef idx="1">
+          <a:schemeClr val="accent1"/>
+        </a:effectRef>
+        <a:fontRef idx="minor">
+          <a:schemeClr val="tx1"/>
+        </a:fontRef>
+      </a:style>
+    </a:lnDef>
+  </a:objectDefaults>
   <a:extraClrSchemeLst/>
-  <a:extLst>
-    <a:ext uri="{05A4C25C-085E-4340-85A3-A5531E510DB2}">
-      <thm15:themeFamily xmlns:thm15="http://schemas.microsoft.com/office/thememl/2012/main" name="Office Theme" id="{2E142A2C-CD16-42D6-873A-C26D2A0506FA}" vid="{1BDDFF52-6CD6-40A5-AB3C-68EB2F1E4D0A}"/>
-    </a:ext>
-  </a:extLst>
 </a:theme>
 </file>
</xml_diff>